<commit_message>
Merapikan tampilan dan penyesuaian beberapa fitur
</commit_message>
<xml_diff>
--- a/resources/documents/Template_SPT_Perjadin_COLLECTIVE_V5.docx
+++ b/resources/documents/Template_SPT_Perjadin_COLLECTIVE_V5.docx
@@ -1506,779 +1506,240 @@
         <w:spacing w:before="56"/>
       </w:pPr>
     </w:p>
-    <w:p>
-      <w:pPr>
-        <w:pStyle w:val="BodyText"/>
-        <w:ind w:left="648"/>
-      </w:pPr>
-      <w:r>
-        <w:t>Demikian</w:t>
-      </w:r>
-      <w:r>
-        <w:rPr>
-          <w:spacing w:val="-7"/>
-        </w:rPr>
-        <w:t xml:space="preserve"> </w:t>
-      </w:r>
-      <w:r>
-        <w:t>Surat</w:t>
-      </w:r>
-      <w:r>
-        <w:rPr>
-          <w:spacing w:val="-7"/>
-        </w:rPr>
-        <w:t xml:space="preserve"> </w:t>
-      </w:r>
-      <w:r>
-        <w:t>Tugas</w:t>
-      </w:r>
-      <w:r>
-        <w:rPr>
-          <w:spacing w:val="-5"/>
-        </w:rPr>
-        <w:t xml:space="preserve"> </w:t>
-      </w:r>
-      <w:r>
-        <w:t>ini</w:t>
-      </w:r>
-      <w:r>
-        <w:rPr>
-          <w:spacing w:val="-6"/>
-        </w:rPr>
-        <w:t xml:space="preserve"> </w:t>
-      </w:r>
-      <w:r>
-        <w:t>dibuat</w:t>
-      </w:r>
-      <w:r>
-        <w:rPr>
-          <w:spacing w:val="-4"/>
-        </w:rPr>
-        <w:t xml:space="preserve"> </w:t>
-      </w:r>
-      <w:r>
-        <w:t>untuk</w:t>
-      </w:r>
-      <w:r>
-        <w:rPr>
-          <w:spacing w:val="-1"/>
-        </w:rPr>
-        <w:t xml:space="preserve"> </w:t>
-      </w:r>
-      <w:r>
-        <w:t>dilaksanakan</w:t>
-      </w:r>
-      <w:r>
-        <w:rPr>
-          <w:spacing w:val="-6"/>
-        </w:rPr>
-        <w:t xml:space="preserve"> </w:t>
-      </w:r>
-      <w:r>
-        <w:t>dengan</w:t>
-      </w:r>
-      <w:r>
-        <w:rPr>
-          <w:spacing w:val="-5"/>
-        </w:rPr>
-        <w:t xml:space="preserve"> </w:t>
-      </w:r>
-      <w:r>
-        <w:t>penuh</w:t>
-      </w:r>
-      <w:r>
-        <w:rPr>
-          <w:spacing w:val="-7"/>
-        </w:rPr>
-        <w:t xml:space="preserve"> </w:t>
-      </w:r>
-      <w:r>
-        <w:t>tanggung</w:t>
-      </w:r>
-      <w:r>
-        <w:rPr>
-          <w:spacing w:val="-6"/>
-        </w:rPr>
-        <w:t xml:space="preserve"> </w:t>
-      </w:r>
-      <w:r>
-        <w:rPr>
-          <w:spacing w:val="-2"/>
-        </w:rPr>
-        <w:t>jawab</w:t>
-      </w:r>
-    </w:p>
-    <w:p>
-      <w:pPr>
-        <w:pStyle w:val="BodyText"/>
-      </w:pPr>
-    </w:p>
-    <w:p>
-      <w:pPr>
-        <w:pStyle w:val="BodyText"/>
-        <w:ind w:left="7694" w:right="1281" w:hanging="537"/>
-      </w:pPr>
-      <w:r>
-        <w:rPr>
-          <w:noProof/>
-        </w:rPr>
-        <mc:AlternateContent>
-          <mc:Choice Requires="wps">
-            <w:drawing>
-              <wp:anchor distT="0" distB="0" distL="0" distR="0" simplePos="0" relativeHeight="487468032" behindDoc="1" locked="0" layoutInCell="1" allowOverlap="1" wp14:anchorId="7F3245EF" wp14:editId="46B1D30A">
-                <wp:simplePos x="0" y="0"/>
-                <wp:positionH relativeFrom="page">
-                  <wp:posOffset>5244084</wp:posOffset>
-                </wp:positionH>
-                <wp:positionV relativeFrom="paragraph">
-                  <wp:posOffset>881735</wp:posOffset>
-                </wp:positionV>
-                <wp:extent cx="1021080" cy="170815"/>
-                <wp:effectExtent l="0" t="0" r="0" b="0"/>
-                <wp:wrapNone/>
-                <wp:docPr id="9" name="Textbox 9"/>
-                <wp:cNvGraphicFramePr>
-                  <a:graphicFrameLocks xmlns:a="http://schemas.openxmlformats.org/drawingml/2006/main"/>
-                </wp:cNvGraphicFramePr>
-                <a:graphic xmlns:a="http://schemas.openxmlformats.org/drawingml/2006/main">
-                  <a:graphicData uri="http://schemas.microsoft.com/office/word/2010/wordprocessingShape">
-                    <wps:wsp>
-                      <wps:cNvSpPr txBox="1">
-                        <a:spLocks/>
-                      </wps:cNvSpPr>
-                      <wps:spPr>
-                        <a:xfrm>
-                          <a:off x="0" y="0"/>
-                          <a:ext cx="1021080" cy="170815"/>
-                        </a:xfrm>
-                        <a:prstGeom prst="rect">
-                          <a:avLst/>
-                        </a:prstGeom>
-                      </wps:spPr>
-                      <wps:txbx>
-                        <w:txbxContent>
-                          <w:p>
-                            <w:pPr>
-                              <w:pStyle w:val="BodyText"/>
-                              <w:spacing w:line="268" w:lineRule="exact"/>
-                            </w:pPr>
-                            <w:r>
-                              <w:rPr>
-                                <w:spacing w:val="-2"/>
-                              </w:rPr>
-                              <w:t>${ttd_pengirim}</w:t>
-                            </w:r>
-                          </w:p>
-                        </w:txbxContent>
-                      </wps:txbx>
-                      <wps:bodyPr wrap="square" lIns="0" tIns="0" rIns="0" bIns="0" rtlCol="0">
-                        <a:noAutofit/>
-                      </wps:bodyPr>
-                    </wps:wsp>
-                  </a:graphicData>
-                </a:graphic>
-              </wp:anchor>
-            </w:drawing>
-          </mc:Choice>
-          <mc:Fallback xmlns:w16cei="http://schemas.microsoft.com/office/word/2026/wordml/cei">
-            <w:pict>
-              <v:shapetype w14:anchorId="7F3245EF" id="_x0000_t202" coordsize="21600,21600" o:spt="202" path="m,l,21600r21600,l21600,xe">
-                <v:stroke joinstyle="miter"/>
-                <v:path gradientshapeok="t" o:connecttype="rect"/>
-              </v:shapetype>
-              <v:shape id="Textbox 9" o:spid="_x0000_s1026" type="#_x0000_t202" style="position:absolute;left:0;text-align:left;margin-left:412.9pt;margin-top:69.45pt;width:80.4pt;height:13.45pt;z-index:-15848448;visibility:visible;mso-wrap-style:square;mso-wrap-distance-left:0;mso-wrap-distance-top:0;mso-wrap-distance-right:0;mso-wrap-distance-bottom:0;mso-position-horizontal:absolute;mso-position-horizontal-relative:page;mso-position-vertical:absolute;mso-position-vertical-relative:text;v-text-anchor:top" o:gfxdata="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" filled="f" stroked="f">
-                <v:textbox inset="0,0,0,0">
-                  <w:txbxContent>
-                    <w:p>
-                      <w:pPr>
-                        <w:pStyle w:val="BodyText"/>
-                        <w:spacing w:line="268" w:lineRule="exact"/>
-                      </w:pPr>
-                      <w:r>
-                        <w:rPr>
-                          <w:spacing w:val="-2"/>
-                        </w:rPr>
-                        <w:t>${ttd_pengirim}</w:t>
-                      </w:r>
-                    </w:p>
-                  </w:txbxContent>
-                </v:textbox>
-                <w10:wrap anchorx="page"/>
-              </v:shape>
-            </w:pict>
-          </mc:Fallback>
-        </mc:AlternateContent>
-      </w:r>
-      <w:r>
-        <w:rPr>
-          <w:noProof/>
-        </w:rPr>
-        <mc:AlternateContent>
-          <mc:Choice Requires="wps">
-            <w:drawing>
-              <wp:anchor distT="0" distB="0" distL="0" distR="0" simplePos="0" relativeHeight="15731200" behindDoc="0" locked="0" layoutInCell="1" allowOverlap="1" wp14:anchorId="2EFA1228" wp14:editId="4A97551C">
-                <wp:simplePos x="0" y="0"/>
-                <wp:positionH relativeFrom="page">
-                  <wp:posOffset>5244084</wp:posOffset>
-                </wp:positionH>
-                <wp:positionV relativeFrom="paragraph">
-                  <wp:posOffset>855868</wp:posOffset>
-                </wp:positionV>
-                <wp:extent cx="1021080" cy="209550"/>
-                <wp:effectExtent l="0" t="0" r="0" b="0"/>
-                <wp:wrapNone/>
-                <wp:docPr id="10" name="Graphic 10"/>
-                <wp:cNvGraphicFramePr>
-                  <a:graphicFrameLocks xmlns:a="http://schemas.openxmlformats.org/drawingml/2006/main"/>
-                </wp:cNvGraphicFramePr>
-                <a:graphic xmlns:a="http://schemas.openxmlformats.org/drawingml/2006/main">
-                  <a:graphicData uri="http://schemas.microsoft.com/office/word/2010/wordprocessingShape">
-                    <wps:wsp>
-                      <wps:cNvSpPr>
-                        <a:spLocks/>
-                      </wps:cNvSpPr>
-                      <wps:spPr>
-                        <a:xfrm>
-                          <a:off x="0" y="0"/>
-                          <a:ext cx="1021080" cy="209550"/>
-                        </a:xfrm>
-                        <a:custGeom>
-                          <a:avLst/>
-                          <a:gdLst/>
-                          <a:ahLst/>
-                          <a:cxnLst/>
-                          <a:rect l="l" t="t" r="r" b="b"/>
-                          <a:pathLst>
-                            <a:path w="1021080" h="209550">
-                              <a:moveTo>
-                                <a:pt x="1020623" y="0"/>
-                              </a:moveTo>
-                              <a:lnTo>
-                                <a:pt x="0" y="0"/>
-                              </a:lnTo>
-                              <a:lnTo>
-                                <a:pt x="0" y="209398"/>
-                              </a:lnTo>
-                              <a:lnTo>
-                                <a:pt x="1020623" y="209398"/>
-                              </a:lnTo>
-                              <a:lnTo>
-                                <a:pt x="1020623" y="0"/>
-                              </a:lnTo>
-                              <a:close/>
-                            </a:path>
-                          </a:pathLst>
-                        </a:custGeom>
-                        <a:solidFill>
-                          <a:srgbClr val="FFFFFF"/>
-                        </a:solidFill>
-                      </wps:spPr>
-                      <wps:bodyPr wrap="square" lIns="0" tIns="0" rIns="0" bIns="0" rtlCol="0">
-                        <a:prstTxWarp prst="textNoShape">
-                          <a:avLst/>
-                        </a:prstTxWarp>
-                        <a:noAutofit/>
-                      </wps:bodyPr>
-                    </wps:wsp>
-                  </a:graphicData>
-                </a:graphic>
-              </wp:anchor>
-            </w:drawing>
-          </mc:Choice>
-          <mc:Fallback xmlns:w16cei="http://schemas.microsoft.com/office/word/2026/wordml/cei">
-            <w:pict>
-              <v:shape w14:anchorId="08471DCA" id="Graphic 10" o:spid="_x0000_s1026" style="position:absolute;margin-left:412.9pt;margin-top:67.4pt;width:80.4pt;height:16.5pt;z-index:15731200;visibility:visible;mso-wrap-style:square;mso-wrap-distance-left:0;mso-wrap-distance-top:0;mso-wrap-distance-right:0;mso-wrap-distance-bottom:0;mso-position-horizontal:absolute;mso-position-horizontal-relative:page;mso-position-vertical:absolute;mso-position-vertical-relative:text;v-text-anchor:top" coordsize="1021080,209550" o:gfxdata="UEsDBBQABgAIAAAAIQC2gziS/gAAAOEBAAATAAAAW0NvbnRlbnRfVHlwZXNdLnhtbJSRQU7DMBBF 90jcwfIWJU67QAgl6YK0S0CoHGBkTxKLZGx5TGhvj5O2G0SRWNoz/78nu9wcxkFMGNg6quQqL6RA 0s5Y6ir5vt9lD1JwBDIwOMJKHpHlpr69KfdHjyxSmriSfYz+USnWPY7AufNIadK6MEJMx9ApD/oD OlTrorhX2lFEilmcO2RdNtjC5xDF9pCuTyYBB5bi6bQ4syoJ3g9WQ0ymaiLzg5KdCXlKLjvcW893 SUOqXwnz5DrgnHtJTxOsQfEKIT7DmDSUCaxw7Rqn8787ZsmRM9e2VmPeBN4uqYvTtW7jvijg9N/y JsXecLq0q+WD6m8AAAD//wMAUEsDBBQABgAIAAAAIQA4/SH/1gAAAJQBAAALAAAAX3JlbHMvLnJl bHOkkMFqwzAMhu+DvYPRfXGawxijTi+j0GvpHsDYimMaW0Yy2fr2M4PBMnrbUb/Q94l/f/hMi1qR JVI2sOt6UJgd+ZiDgffL8ekFlFSbvV0oo4EbChzGx4f9GRdb25HMsYhqlCwG5lrLq9biZkxWOiqY 22YiTra2kYMu1l1tQD30/bPm3wwYN0x18gb45AdQl1tp5j/sFB2T0FQ7R0nTNEV3j6o9feQzro1i OWA14Fm+Q8a1a8+Bvu/d/dMb2JY5uiPbhG/ktn4cqGU/er3pcvwCAAD//wMAUEsDBBQABgAIAAAA IQBMTUPZJQIAAMUEAAAOAAAAZHJzL2Uyb0RvYy54bWysVMFu2zAMvQ/YPwi6L3ZStGiNOMXQIsOA oivQFDsrshwbk0WNUmLn70fJkWtspw3zQabMJ+rxkfT6fug0Oyl0LZiSLxc5Z8pIqFpzKPnbbvvp ljPnhamEBqNKflaO328+flj3tlAraEBXChkFMa7obckb722RZU42qhNuAVYZctaAnfC0xUNWoegp eqezVZ7fZD1gZRGkco6+Po5Ovonx61pJ/62unfJMl5y4+bhiXPdhzTZrURxQ2KaVFxriH1h0ojV0 6RTqUXjBjtj+EaprJYKD2i8kdBnUdStVzIGyWea/ZfPaCKtiLiSOs5NM7v+Flc+nV/uCgbqzTyB/ OFIk660rJk/YuAtmqLELWCLOhqjieVJRDZ5J+rjMV8v8lsSW5Fvld9fXUeZMFOm0PDr/RUGMJE5P zo9VqJIlmmTJwSQTqZahijpW0XNGVUTOqIr7sYpW+HAu0Asm62dUmolJcHdwUjuIQB/SIMb5zeqK s5QMcX3HaDPHUl4zVPKlt43xRgylfnV3G7hRuARI7xE4v/gv4UnTFFBqcGq8K2QfL50UIQJzzR3o ttq2WgcJHB72DxrZSZC42/hcOM9gsSPGJgjtsIfq/IKsp7kpuft5FKg4018NNWYYsmRgMvbJQK8f II5iVB+d3w3fBVpmySy5px56htT2okjNQfwDYMSGkwY+Hz3UbeicyG1kdNnQrMT8L3MdhnG+j6j3 v8/mFwAAAP//AwBQSwMEFAAGAAgAAAAhAFtRNyjiAAAAEAEAAA8AAABkcnMvZG93bnJldi54bWxM T0tPwzAMviPxHyIjcWMpYwuhazpVPC5IHOg4cEyb0FYkTmmytfx7zAkulu3P/h7FfvGOnewUh4AK rlcZMIttMAN2Ct4OT1cSWEwajXYBrYJvG2Ffnp8VOjdhxld7qlPHiARjrhX0KY0557HtrddxFUaL hH2EyetE49RxM+mZyL3j6ywT3OsBSaHXo73vbftZH70C8YwNVrqq07J1B/n10j2+b2alLi+Whx2V agcs2SX9fcBvBvIPJRlrwhFNZE6BXG/JfyLgZkMNXdxJIYA1tBG3EnhZ8P9Byh8AAAD//wMAUEsB Ai0AFAAGAAgAAAAhALaDOJL+AAAA4QEAABMAAAAAAAAAAAAAAAAAAAAAAFtDb250ZW50X1R5cGVz XS54bWxQSwECLQAUAAYACAAAACEAOP0h/9YAAACUAQAACwAAAAAAAAAAAAAAAAAvAQAAX3JlbHMv LnJlbHNQSwECLQAUAAYACAAAACEATE1D2SUCAADFBAAADgAAAAAAAAAAAAAAAAAuAgAAZHJzL2Uy b0RvYy54bWxQSwECLQAUAAYACAAAACEAW1E3KOIAAAAQAQAADwAAAAAAAAAAAAAAAAB/BAAAZHJz L2Rvd25yZXYueG1sUEsFBgAAAAAEAAQA8wAAAI4FAAAAAA== " path="m1020623,l,,,209398r1020623,l1020623,xe" stroked="f">
-                <v:path arrowok="t"/>
-                <w10:wrap anchorx="page"/>
-              </v:shape>
-            </w:pict>
-          </mc:Fallback>
-        </mc:AlternateContent>
-      </w:r>
-      <w:r>
-        <w:rPr>
-          <w:noProof/>
-        </w:rPr>
-        <mc:AlternateContent>
-          <mc:Choice Requires="wps">
-            <w:drawing>
-              <wp:anchor distT="0" distB="0" distL="0" distR="0" simplePos="0" relativeHeight="251653632" behindDoc="0" locked="0" layoutInCell="1" allowOverlap="1" wp14:anchorId="5085EB91" wp14:editId="4E5F72A5">
-                <wp:simplePos x="0" y="0"/>
-                <wp:positionH relativeFrom="page">
-                  <wp:posOffset>637540</wp:posOffset>
-                </wp:positionH>
-                <wp:positionV relativeFrom="paragraph">
-                  <wp:posOffset>131460</wp:posOffset>
-                </wp:positionV>
-                <wp:extent cx="3210560" cy="818515"/>
-                <wp:effectExtent l="0" t="0" r="0" b="0"/>
-                <wp:wrapNone/>
-                <wp:docPr id="12" name="Textbox 12"/>
-                <wp:cNvGraphicFramePr>
-                  <a:graphicFrameLocks xmlns:a="http://schemas.openxmlformats.org/drawingml/2006/main"/>
-                </wp:cNvGraphicFramePr>
-                <a:graphic xmlns:a="http://schemas.openxmlformats.org/drawingml/2006/main">
-                  <a:graphicData uri="http://schemas.microsoft.com/office/word/2010/wordprocessingShape">
-                    <wps:wsp>
-                      <wps:cNvSpPr txBox="1">
-                        <a:spLocks/>
-                      </wps:cNvSpPr>
-                      <wps:spPr>
-                        <a:xfrm>
-                          <a:off x="0" y="0"/>
-                          <a:ext cx="3210560" cy="818515"/>
-                        </a:xfrm>
-                        <a:prstGeom prst="rect">
-                          <a:avLst/>
-                        </a:prstGeom>
-                        <a:ln w="25400">
-                          <a:solidFill>
-                            <a:srgbClr val="000000"/>
-                          </a:solidFill>
-                          <a:prstDash val="solid"/>
-                        </a:ln>
-                      </wps:spPr>
-                      <wps:txbx>
-                        <w:txbxContent>
-                          <w:p>
-                            <w:pPr>
-                              <w:spacing w:before="65"/>
-                              <w:ind w:left="144" w:right="142"/>
-                              <w:jc w:val="both"/>
-                              <w:rPr>
-                                <w:rFonts w:ascii="Arial"/>
-                                <w:b/>
-                                <w:sz w:val="24"/>
-                              </w:rPr>
-                            </w:pPr>
-                            <w:r>
-                              <w:rPr>
-                                <w:rFonts w:ascii="Arial"/>
-                                <w:b/>
-                                <w:sz w:val="24"/>
-                              </w:rPr>
-                              <w:t xml:space="preserve">Pelaksana yang ditugaskan oleh BPVP </w:t>
-                            </w:r>
-                            <w:r>
-                              <w:rPr>
-                                <w:rFonts w:ascii="Arial"/>
-                                <w:b/>
-                                <w:spacing w:val="-2"/>
-                                <w:sz w:val="24"/>
-                              </w:rPr>
-                              <w:t>Pangkep</w:t>
-                            </w:r>
-                            <w:r>
-                              <w:rPr>
-                                <w:rFonts w:ascii="Arial"/>
-                                <w:b/>
-                                <w:spacing w:val="-7"/>
-                                <w:sz w:val="24"/>
-                              </w:rPr>
-                              <w:t xml:space="preserve"> </w:t>
-                            </w:r>
-                            <w:r>
-                              <w:rPr>
-                                <w:rFonts w:ascii="Arial"/>
-                                <w:b/>
-                                <w:spacing w:val="-2"/>
-                                <w:sz w:val="24"/>
-                              </w:rPr>
-                              <w:t>tidak</w:t>
-                            </w:r>
-                            <w:r>
-                              <w:rPr>
-                                <w:rFonts w:ascii="Arial"/>
-                                <w:b/>
-                                <w:spacing w:val="-10"/>
-                                <w:sz w:val="24"/>
-                              </w:rPr>
-                              <w:t xml:space="preserve"> </w:t>
-                            </w:r>
-                            <w:r>
-                              <w:rPr>
-                                <w:rFonts w:ascii="Arial"/>
-                                <w:b/>
-                                <w:spacing w:val="-2"/>
-                                <w:sz w:val="24"/>
-                              </w:rPr>
-                              <w:t>menerima</w:t>
-                            </w:r>
-                            <w:r>
-                              <w:rPr>
-                                <w:rFonts w:ascii="Arial"/>
-                                <w:b/>
-                                <w:spacing w:val="-10"/>
-                                <w:sz w:val="24"/>
-                              </w:rPr>
-                              <w:t xml:space="preserve"> </w:t>
-                            </w:r>
-                            <w:r>
-                              <w:rPr>
-                                <w:rFonts w:ascii="Arial"/>
-                                <w:b/>
-                                <w:spacing w:val="-2"/>
-                                <w:sz w:val="24"/>
-                              </w:rPr>
-                              <w:t xml:space="preserve">gratifikasi dalam </w:t>
-                            </w:r>
-                            <w:r>
-                              <w:rPr>
-                                <w:rFonts w:ascii="Arial"/>
-                                <w:b/>
-                                <w:sz w:val="24"/>
-                              </w:rPr>
-                              <w:t xml:space="preserve">bentuk apapun sesuai ketentuan yang </w:t>
-                            </w:r>
-                            <w:r>
-                              <w:rPr>
-                                <w:rFonts w:ascii="Arial"/>
-                                <w:b/>
-                                <w:spacing w:val="-2"/>
-                                <w:sz w:val="24"/>
-                              </w:rPr>
-                              <w:t>berlaku</w:t>
-                            </w:r>
-                          </w:p>
-                        </w:txbxContent>
-                      </wps:txbx>
-                      <wps:bodyPr wrap="square" lIns="0" tIns="0" rIns="0" bIns="0" rtlCol="0">
-                        <a:noAutofit/>
-                      </wps:bodyPr>
-                    </wps:wsp>
-                  </a:graphicData>
-                </a:graphic>
-              </wp:anchor>
-            </w:drawing>
-          </mc:Choice>
-          <mc:Fallback xmlns:w16cei="http://schemas.microsoft.com/office/word/2026/wordml/cei">
-            <w:pict>
-              <v:shape w14:anchorId="5085EB91" id="Textbox 12" o:spid="_x0000_s1027" type="#_x0000_t202" style="position:absolute;left:0;text-align:left;margin-left:50.2pt;margin-top:10.35pt;width:252.8pt;height:64.45pt;z-index:251653632;visibility:visible;mso-wrap-style:square;mso-wrap-distance-left:0;mso-wrap-distance-top:0;mso-wrap-distance-right:0;mso-wrap-distance-bottom:0;mso-position-horizontal:absolute;mso-position-horizontal-relative:page;mso-position-vertical:absolute;mso-position-vertical-relative:text;v-text-anchor:top" o:gfxdata="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" filled="f" strokeweight="2pt">
-                <v:path arrowok="t"/>
-                <v:textbox inset="0,0,0,0">
-                  <w:txbxContent>
-                    <w:p>
-                      <w:pPr>
-                        <w:spacing w:before="65"/>
-                        <w:ind w:left="144" w:right="142"/>
-                        <w:jc w:val="both"/>
-                        <w:rPr>
-                          <w:rFonts w:ascii="Arial"/>
-                          <w:b/>
-                          <w:sz w:val="24"/>
-                        </w:rPr>
-                      </w:pPr>
-                      <w:r>
-                        <w:rPr>
-                          <w:rFonts w:ascii="Arial"/>
-                          <w:b/>
-                          <w:sz w:val="24"/>
-                        </w:rPr>
-                        <w:t xml:space="preserve">Pelaksana yang ditugaskan oleh BPVP </w:t>
-                      </w:r>
-                      <w:r>
-                        <w:rPr>
-                          <w:rFonts w:ascii="Arial"/>
-                          <w:b/>
-                          <w:spacing w:val="-2"/>
-                          <w:sz w:val="24"/>
-                        </w:rPr>
-                        <w:t>Pangkep</w:t>
-                      </w:r>
-                      <w:r>
-                        <w:rPr>
-                          <w:rFonts w:ascii="Arial"/>
-                          <w:b/>
-                          <w:spacing w:val="-7"/>
-                          <w:sz w:val="24"/>
-                        </w:rPr>
-                        <w:t xml:space="preserve"> </w:t>
-                      </w:r>
-                      <w:r>
-                        <w:rPr>
-                          <w:rFonts w:ascii="Arial"/>
-                          <w:b/>
-                          <w:spacing w:val="-2"/>
-                          <w:sz w:val="24"/>
-                        </w:rPr>
-                        <w:t>tidak</w:t>
-                      </w:r>
-                      <w:r>
-                        <w:rPr>
-                          <w:rFonts w:ascii="Arial"/>
-                          <w:b/>
-                          <w:spacing w:val="-10"/>
-                          <w:sz w:val="24"/>
-                        </w:rPr>
-                        <w:t xml:space="preserve"> </w:t>
-                      </w:r>
-                      <w:r>
-                        <w:rPr>
-                          <w:rFonts w:ascii="Arial"/>
-                          <w:b/>
-                          <w:spacing w:val="-2"/>
-                          <w:sz w:val="24"/>
-                        </w:rPr>
-                        <w:t>menerima</w:t>
-                      </w:r>
-                      <w:r>
-                        <w:rPr>
-                          <w:rFonts w:ascii="Arial"/>
-                          <w:b/>
-                          <w:spacing w:val="-10"/>
-                          <w:sz w:val="24"/>
-                        </w:rPr>
-                        <w:t xml:space="preserve"> </w:t>
-                      </w:r>
-                      <w:r>
-                        <w:rPr>
-                          <w:rFonts w:ascii="Arial"/>
-                          <w:b/>
-                          <w:spacing w:val="-2"/>
-                          <w:sz w:val="24"/>
-                        </w:rPr>
-                        <w:t xml:space="preserve">gratifikasi dalam </w:t>
-                      </w:r>
-                      <w:r>
-                        <w:rPr>
-                          <w:rFonts w:ascii="Arial"/>
-                          <w:b/>
-                          <w:sz w:val="24"/>
-                        </w:rPr>
-                        <w:t xml:space="preserve">bentuk apapun sesuai ketentuan yang </w:t>
-                      </w:r>
-                      <w:r>
-                        <w:rPr>
-                          <w:rFonts w:ascii="Arial"/>
-                          <w:b/>
-                          <w:spacing w:val="-2"/>
-                          <w:sz w:val="24"/>
-                        </w:rPr>
-                        <w:t>berlaku</w:t>
-                      </w:r>
-                    </w:p>
-                  </w:txbxContent>
-                </v:textbox>
-                <w10:wrap anchorx="page"/>
-              </v:shape>
-            </w:pict>
-          </mc:Fallback>
-        </mc:AlternateContent>
-      </w:r>
-      <w:r>
-        <w:t>Pangkep,</w:t>
-      </w:r>
-      <w:r>
-        <w:rPr>
-          <w:spacing w:val="-15"/>
-        </w:rPr>
-        <w:t xml:space="preserve"> </w:t>
-      </w:r>
-      <w:r>
-        <w:t>${tanggal_surat}</w:t>
-      </w:r>
-      <w:r>
-        <w:br/>
-        <w:t>Kepala Balai,</w:t>
-      </w:r>
-    </w:p>
-    <w:p>
-      <w:pPr>
-        <w:pStyle w:val="BodyText"/>
-      </w:pPr>
-      <w:r>
-        <w:rPr>
-          <w:noProof/>
-        </w:rPr>
-        <mc:AlternateContent>
-          <mc:Choice Requires="wps">
-            <w:drawing>
-              <wp:anchor distT="0" distB="0" distL="0" distR="0" simplePos="0" relativeHeight="251652608" behindDoc="0" locked="0" layoutInCell="1" allowOverlap="1" wp14:anchorId="2AA8DF13" wp14:editId="04881DB1">
-                <wp:simplePos x="0" y="0"/>
-                <wp:positionH relativeFrom="page">
-                  <wp:posOffset>5042881</wp:posOffset>
-                </wp:positionH>
-                <wp:positionV relativeFrom="paragraph">
-                  <wp:posOffset>110490</wp:posOffset>
-                </wp:positionV>
-                <wp:extent cx="972185" cy="972185"/>
-                <wp:effectExtent l="0" t="0" r="0" b="0"/>
-                <wp:wrapNone/>
-                <wp:docPr id="11" name="Textbox 11"/>
-                <wp:cNvGraphicFramePr>
-                  <a:graphicFrameLocks xmlns:a="http://schemas.openxmlformats.org/drawingml/2006/main"/>
-                </wp:cNvGraphicFramePr>
-                <a:graphic xmlns:a="http://schemas.openxmlformats.org/drawingml/2006/main">
-                  <a:graphicData uri="http://schemas.microsoft.com/office/word/2010/wordprocessingShape">
-                    <wps:wsp>
-                      <wps:cNvSpPr txBox="1">
-                        <a:spLocks/>
-                      </wps:cNvSpPr>
-                      <wps:spPr>
-                        <a:xfrm>
-                          <a:off x="0" y="0"/>
-                          <a:ext cx="972185" cy="972185"/>
-                        </a:xfrm>
-                        <a:prstGeom prst="rect">
-                          <a:avLst/>
-                        </a:prstGeom>
-                      </wps:spPr>
-                      <wps:txbx>
-                        <w:txbxContent>
-                          <w:p>
-                            <w:pPr>
-                              <w:pStyle w:val="BodyText"/>
-                            </w:pPr>
-                          </w:p>
-                          <w:p>
-                            <w:pPr>
-                              <w:pStyle w:val="BodyText"/>
-                              <w:spacing w:before="68"/>
-                            </w:pPr>
-                          </w:p>
-                          <w:p>
-                            <w:pPr>
-                              <w:pStyle w:val="BodyText"/>
-                              <w:ind w:left="485"/>
-                            </w:pPr>
-                            <w:r>
-                              <w:rPr>
-                                <w:spacing w:val="-2"/>
-                              </w:rPr>
-                              <w:t>${ttd}</w:t>
-                            </w:r>
-                          </w:p>
-                        </w:txbxContent>
-                      </wps:txbx>
-                      <wps:bodyPr wrap="square" lIns="0" tIns="0" rIns="0" bIns="0" rtlCol="0">
-                        <a:noAutofit/>
-                      </wps:bodyPr>
-                    </wps:wsp>
-                  </a:graphicData>
-                </a:graphic>
-              </wp:anchor>
-            </w:drawing>
-          </mc:Choice>
-          <mc:Fallback xmlns:w16cei="http://schemas.microsoft.com/office/word/2026/wordml/cei">
-            <w:pict>
-              <v:shape w14:anchorId="2AA8DF13" id="Textbox 11" o:spid="_x0000_s1028" type="#_x0000_t202" style="position:absolute;margin-left:397.1pt;margin-top:8.7pt;width:76.55pt;height:76.55pt;z-index:251652608;visibility:visible;mso-wrap-style:square;mso-wrap-distance-left:0;mso-wrap-distance-top:0;mso-wrap-distance-right:0;mso-wrap-distance-bottom:0;mso-position-horizontal:absolute;mso-position-horizontal-relative:page;mso-position-vertical:absolute;mso-position-vertical-relative:text;v-text-anchor:top" o:gfxdata="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" filled="f" stroked="f">
-                <v:textbox inset="0,0,0,0">
-                  <w:txbxContent>
-                    <w:p>
-                      <w:pPr>
-                        <w:pStyle w:val="BodyText"/>
-                      </w:pPr>
-                    </w:p>
-                    <w:p>
-                      <w:pPr>
-                        <w:pStyle w:val="BodyText"/>
-                        <w:spacing w:before="68"/>
-                      </w:pPr>
-                    </w:p>
-                    <w:p>
-                      <w:pPr>
-                        <w:pStyle w:val="BodyText"/>
-                        <w:ind w:left="485"/>
-                      </w:pPr>
-                      <w:r>
-                        <w:rPr>
-                          <w:spacing w:val="-2"/>
-                        </w:rPr>
-                        <w:t>${ttd}</w:t>
-                      </w:r>
-                    </w:p>
-                  </w:txbxContent>
-                </v:textbox>
-                <w10:wrap anchorx="page"/>
-              </v:shape>
-            </w:pict>
-          </mc:Fallback>
-        </mc:AlternateContent>
-      </w:r>
-    </w:p>
-    <w:p>
-      <w:pPr>
-        <w:pStyle w:val="BodyText"/>
-      </w:pPr>
-    </w:p>
-    <w:p>
-      <w:pPr>
-        <w:pStyle w:val="BodyText"/>
-      </w:pPr>
-    </w:p>
-    <w:p>
-      <w:pPr>
-        <w:pStyle w:val="BodyText"/>
-      </w:pPr>
-    </w:p>
-    <w:p>
-      <w:pPr>
-        <w:pStyle w:val="BodyText"/>
-      </w:pPr>
-    </w:p>
-    <w:p>
-      <w:pPr>
-        <w:pStyle w:val="BodyText"/>
-      </w:pPr>
-    </w:p>
-    <w:p>
-      <w:pPr>
-        <w:pStyle w:val="BodyText"/>
-        <w:spacing w:before="1"/>
-      </w:pPr>
-    </w:p>
-    <w:p>
-      <w:pPr>
-        <w:pStyle w:val="BodyText"/>
-        <w:ind w:left="7158"/>
-      </w:pPr>
-      <w:r>
-        <w:t>Ashari</w:t>
-      </w:r>
-      <w:r>
-        <w:rPr>
-          <w:spacing w:val="-5"/>
-        </w:rPr>
-        <w:t xml:space="preserve"> </w:t>
-      </w:r>
-      <w:r>
-        <w:t>Arifuddin,</w:t>
-      </w:r>
-      <w:r>
-        <w:rPr>
-          <w:spacing w:val="-3"/>
-        </w:rPr>
-        <w:t xml:space="preserve"> </w:t>
-      </w:r>
-      <w:r>
-        <w:t>S.T.,</w:t>
-      </w:r>
-      <w:r>
-        <w:rPr>
-          <w:spacing w:val="-3"/>
-        </w:rPr>
-        <w:t xml:space="preserve"> </w:t>
-      </w:r>
-      <w:r>
-        <w:rPr>
-          <w:spacing w:val="-5"/>
-        </w:rPr>
-        <w:t>M.M</w:t>
-      </w:r>
-    </w:p>
-    <w:p>
-      <w:pPr>
-        <w:pStyle w:val="BodyText"/>
-        <w:sectPr>
-          <w:footerReference w:type="default" r:id="rId14"/>
-          <w:type w:val="continuous"/>
-          <w:pgSz w:w="12240" w:h="18720"/>
-          <w:pgMar w:top="380" w:right="360" w:bottom="820" w:left="360" w:header="0" w:footer="639" w:gutter="0"/>
-          <w:pgNumType w:start="1"/>
-          <w:cols w:space="720"/>
-        </w:sectPr>
-      </w:pPr>
-    </w:p>
+    <w:tbl>
+      <w:tblPr>
+        <w:tblW w:type="dxa" w:w="10224"/>
+        <w:jc w:val="left"/>
+        <w:tblLayout w:type="fixed"/>
+        <w:tblLook w:firstColumn="1" w:firstRow="1" w:lastColumn="0" w:lastRow="0" w:noHBand="0" w:noVBand="1" w:val="04A0"/>
+        <w:tblInd w:type="dxa" w:w="648"/>
+        <w:tblBorders>
+          <w:top w:val="nil" w:sz="0" w:space="0" w:color="000000"/>
+          <w:left w:val="nil" w:sz="0" w:space="0" w:color="000000"/>
+          <w:bottom w:val="nil" w:sz="0" w:space="0" w:color="000000"/>
+          <w:right w:val="nil" w:sz="0" w:space="0" w:color="000000"/>
+          <w:insideH w:val="nil" w:sz="0" w:space="0" w:color="000000"/>
+          <w:insideV w:val="nil" w:sz="0" w:space="0" w:color="000000"/>
+        </w:tblBorders>
+      </w:tblPr>
+      <w:tblGrid>
+        <w:gridCol w:w="5472"/>
+        <w:gridCol w:w="4752"/>
+      </w:tblGrid>
+      <w:tr>
+        <w:trPr>
+          <w:cantSplit/>
+        </w:trPr>
+        <w:tc>
+          <w:tcPr>
+            <w:tcW w:type="dxa" w:w="10224"/>
+            <w:gridSpan w:val="2"/>
+            <w:tcMar>
+              <w:top w:w="0" w:type="dxa"/>
+              <w:start w:w="0" w:type="dxa"/>
+              <w:bottom w:w="180" w:type="dxa"/>
+              <w:end w:w="0" w:type="dxa"/>
+            </w:tcMar>
+            <w:tcBorders>
+              <w:top w:val="nil" w:sz="0" w:space="0" w:color="000000"/>
+              <w:start w:val="nil" w:sz="0" w:space="0" w:color="000000"/>
+              <w:bottom w:val="nil" w:sz="0" w:space="0" w:color="000000"/>
+              <w:end w:val="nil" w:sz="0" w:space="0" w:color="000000"/>
+              <w:insideH w:val="nil" w:sz="0" w:space="0" w:color="000000"/>
+              <w:insideV w:val="nil" w:sz="0" w:space="0" w:color="000000"/>
+            </w:tcBorders>
+            <w:vAlign w:val="top"/>
+          </w:tcPr>
+          <w:p>
+            <w:pPr>
+              <w:pStyle w:val="BodyText"/>
+              <w:keepNext/>
+              <w:keepLines/>
+              <w:spacing w:before="0" w:after="0" w:line="240" w:lineRule="auto"/>
+              <w:jc w:val="left"/>
+            </w:pPr>
+            <w:r>
+              <w:rPr>
+                <w:rFonts w:ascii="Arial MT" w:hAnsi="Arial MT"/>
+                <w:b w:val="0"/>
+                <w:sz w:val="24"/>
+              </w:rPr>
+              <w:t>Demikian Surat Tugas ini dibuat untuk dilaksanakan dengan penuh tanggung jawab</w:t>
+            </w:r>
+          </w:p>
+        </w:tc>
+      </w:tr>
+      <w:tr>
+        <w:trPr>
+          <w:cantSplit/>
+        </w:trPr>
+        <w:tc>
+          <w:tcPr>
+            <w:tcW w:type="dxa" w:w="5472"/>
+            <w:tcMar>
+              <w:top w:w="0" w:type="dxa"/>
+              <w:start w:w="0" w:type="dxa"/>
+              <w:bottom w:w="0" w:type="dxa"/>
+              <w:end w:w="216" w:type="dxa"/>
+            </w:tcMar>
+            <w:tcBorders>
+              <w:top w:val="nil" w:sz="0" w:space="0" w:color="000000"/>
+              <w:start w:val="nil" w:sz="0" w:space="0" w:color="000000"/>
+              <w:bottom w:val="nil" w:sz="0" w:space="0" w:color="000000"/>
+              <w:end w:val="nil" w:sz="0" w:space="0" w:color="000000"/>
+              <w:insideH w:val="nil" w:sz="0" w:space="0" w:color="000000"/>
+              <w:insideV w:val="nil" w:sz="0" w:space="0" w:color="000000"/>
+            </w:tcBorders>
+            <w:vAlign w:val="top"/>
+          </w:tcPr>
+          <w:p>
+            <w:pPr>
+              <w:spacing w:before="0" w:after="0" w:line="20" w:lineRule="exact"/>
+            </w:pPr>
+            <w:r>
+              <w:rPr>
+                <w:sz w:val="2"/>
+              </w:rPr>
+            </w:r>
+          </w:p>
+          <w:tbl>
+            <w:tblPr>
+              <w:tblW w:type="dxa" w:w="5000"/>
+              <w:jc w:val="left"/>
+              <w:tblLayout w:type="fixed"/>
+              <w:tblLook w:firstColumn="1" w:firstRow="1" w:lastColumn="0" w:lastRow="0" w:noHBand="0" w:noVBand="1" w:val="04A0"/>
+              <w:tblInd w:type="dxa" w:w="0"/>
+              <w:tblBorders>
+                <w:top w:val="single" w:sz="16" w:space="0" w:color="000000"/>
+                <w:left w:val="single" w:sz="16" w:space="0" w:color="000000"/>
+                <w:bottom w:val="single" w:sz="16" w:space="0" w:color="000000"/>
+                <w:right w:val="single" w:sz="16" w:space="0" w:color="000000"/>
+                <w:insideH w:val="single" w:sz="16" w:space="0" w:color="000000"/>
+                <w:insideV w:val="single" w:sz="16" w:space="0" w:color="000000"/>
+              </w:tblBorders>
+            </w:tblPr>
+            <w:tblGrid>
+              <w:gridCol w:w="5472"/>
+            </w:tblGrid>
+            <w:tr>
+              <w:trPr>
+                <w:cantSplit/>
+              </w:trPr>
+              <w:tc>
+                <w:tcPr>
+                  <w:tcW w:type="dxa" w:w="5000"/>
+                  <w:tcMar>
+                    <w:top w:w="90" w:type="dxa"/>
+                    <w:start w:w="120" w:type="dxa"/>
+                    <w:bottom w:w="90" w:type="dxa"/>
+                    <w:end w:w="120" w:type="dxa"/>
+                  </w:tcMar>
+                  <w:tcBorders>
+                    <w:top w:val="single" w:sz="16" w:space="0" w:color="000000"/>
+                    <w:start w:val="single" w:sz="16" w:space="0" w:color="000000"/>
+                    <w:bottom w:val="single" w:sz="16" w:space="0" w:color="000000"/>
+                    <w:end w:val="single" w:sz="16" w:space="0" w:color="000000"/>
+                    <w:insideH w:val="single" w:sz="16" w:space="0" w:color="000000"/>
+                    <w:insideV w:val="single" w:sz="16" w:space="0" w:color="000000"/>
+                  </w:tcBorders>
+                </w:tcPr>
+                <w:p>
+                  <w:pPr>
+                    <w:pStyle w:val="BodyText"/>
+                    <w:keepNext/>
+                    <w:keepLines/>
+                    <w:spacing w:before="0" w:after="0" w:line="240" w:lineRule="auto"/>
+                    <w:jc w:val="left"/>
+                  </w:pPr>
+                  <w:r>
+                    <w:rPr>
+                      <w:rFonts w:ascii="Arial MT" w:hAnsi="Arial MT"/>
+                      <w:b/>
+                      <w:sz w:val="22"/>
+                    </w:rPr>
+                    <w:t>Pelaksana yang ditugaskan oleh BPVP Pangkep tidak menerima gratifikasi dalam bentuk apapun sesuai ketentuan yang berlaku</w:t>
+                  </w:r>
+                </w:p>
+              </w:tc>
+            </w:tr>
+          </w:tbl>
+          <w:p/>
+        </w:tc>
+        <w:tc>
+          <w:tcPr>
+            <w:tcW w:type="dxa" w:w="4752"/>
+            <w:tcMar>
+              <w:top w:w="0" w:type="dxa"/>
+              <w:start w:w="0" w:type="dxa"/>
+              <w:bottom w:w="120" w:type="dxa"/>
+              <w:end w:w="0" w:type="dxa"/>
+            </w:tcMar>
+            <w:tcBorders>
+              <w:top w:val="nil" w:sz="0" w:space="0" w:color="000000"/>
+              <w:start w:val="nil" w:sz="0" w:space="0" w:color="000000"/>
+              <w:bottom w:val="nil" w:sz="0" w:space="0" w:color="000000"/>
+              <w:end w:val="nil" w:sz="0" w:space="0" w:color="000000"/>
+              <w:insideH w:val="nil" w:sz="0" w:space="0" w:color="000000"/>
+              <w:insideV w:val="nil" w:sz="0" w:space="0" w:color="000000"/>
+            </w:tcBorders>
+            <w:vAlign w:val="top"/>
+          </w:tcPr>
+          <w:p>
+            <w:pPr>
+              <w:pStyle w:val="BodyText"/>
+              <w:keepNext/>
+              <w:keepLines/>
+              <w:spacing w:before="0" w:after="0" w:line="240" w:lineRule="auto"/>
+              <w:jc w:val="center"/>
+            </w:pPr>
+            <w:r>
+              <w:rPr>
+                <w:rFonts w:ascii="Arial MT" w:hAnsi="Arial MT"/>
+                <w:b w:val="0"/>
+                <w:sz w:val="24"/>
+              </w:rPr>
+              <w:t>Pangkep, ${tanggal_surat}</w:t>
+              <w:br/>
+              <w:t>Kepala Balai,</w:t>
+            </w:r>
+          </w:p>
+          <w:p>
+            <w:pPr>
+              <w:pStyle w:val="BodyText"/>
+              <w:keepNext/>
+              <w:keepLines/>
+              <w:spacing w:before="600" w:after="840" w:line="240" w:lineRule="auto"/>
+              <w:jc w:val="center"/>
+            </w:pPr>
+            <w:r>
+              <w:rPr>
+                <w:rFonts w:ascii="Arial MT" w:hAnsi="Arial MT"/>
+                <w:b w:val="0"/>
+                <w:sz w:val="24"/>
+              </w:rPr>
+              <w:t>${ttd}</w:t>
+            </w:r>
+          </w:p>
+          <w:p>
+            <w:pPr>
+              <w:pStyle w:val="BodyText"/>
+              <w:keepNext w:val="0"/>
+              <w:keepLines/>
+              <w:spacing w:before="0" w:after="0" w:line="240" w:lineRule="auto"/>
+              <w:jc w:val="center"/>
+            </w:pPr>
+            <w:r>
+              <w:rPr>
+                <w:rFonts w:ascii="Arial MT" w:hAnsi="Arial MT"/>
+                <w:b w:val="0"/>
+                <w:sz w:val="24"/>
+              </w:rPr>
+              <w:t>Ashari Arifuddin, S.T., M.M</w:t>
+            </w:r>
+          </w:p>
+        </w:tc>
+      </w:tr>
+    </w:tbl>
     <w:tbl>
       <w:tblPr>
         <w:tblW w:w="0" w:type="auto"/>

</xml_diff>

<commit_message>
Perbaiki Responsive pada bagian officer
</commit_message>
<xml_diff>
--- a/resources/documents/Template_SPT_Perjadin_COLLECTIVE_V5.docx
+++ b/resources/documents/Template_SPT_Perjadin_COLLECTIVE_V5.docx
@@ -1508,23 +1508,22 @@
     </w:p>
     <w:tbl>
       <w:tblPr>
-        <w:tblW w:type="dxa" w:w="10224"/>
-        <w:jc w:val="left"/>
+        <w:tblW w:w="9600" w:type="dxa"/>
+        <w:tblInd w:w="648" w:type="dxa"/>
+        <w:tblBorders>
+          <w:top w:val="nil"/>
+          <w:left w:val="nil"/>
+          <w:bottom w:val="nil"/>
+          <w:right w:val="nil"/>
+          <w:insideH w:val="nil"/>
+          <w:insideV w:val="nil"/>
+        </w:tblBorders>
         <w:tblLayout w:type="fixed"/>
-        <w:tblLook w:firstColumn="1" w:firstRow="1" w:lastColumn="0" w:lastRow="0" w:noHBand="0" w:noVBand="1" w:val="04A0"/>
-        <w:tblInd w:type="dxa" w:w="648"/>
-        <w:tblBorders>
-          <w:top w:val="nil" w:sz="0" w:space="0" w:color="000000"/>
-          <w:left w:val="nil" w:sz="0" w:space="0" w:color="000000"/>
-          <w:bottom w:val="nil" w:sz="0" w:space="0" w:color="000000"/>
-          <w:right w:val="nil" w:sz="0" w:space="0" w:color="000000"/>
-          <w:insideH w:val="nil" w:sz="0" w:space="0" w:color="000000"/>
-          <w:insideV w:val="nil" w:sz="0" w:space="0" w:color="000000"/>
-        </w:tblBorders>
+        <w:tblLook w:val="04A0" w:firstRow="1" w:lastRow="0" w:firstColumn="1" w:lastColumn="0" w:noHBand="0" w:noVBand="1"/>
       </w:tblPr>
       <w:tblGrid>
-        <w:gridCol w:w="5472"/>
-        <w:gridCol w:w="4752"/>
+        <w:gridCol w:w="5141"/>
+        <w:gridCol w:w="4459"/>
       </w:tblGrid>
       <w:tr>
         <w:trPr>
@@ -1532,38 +1531,28 @@
         </w:trPr>
         <w:tc>
           <w:tcPr>
-            <w:tcW w:type="dxa" w:w="10224"/>
+            <w:tcW w:w="9600" w:type="dxa"/>
             <w:gridSpan w:val="2"/>
+            <w:tcBorders>
+              <w:top w:val="nil"/>
+              <w:left w:val="nil"/>
+              <w:bottom w:val="nil"/>
+              <w:right w:val="nil"/>
+            </w:tcBorders>
             <w:tcMar>
               <w:top w:w="0" w:type="dxa"/>
-              <w:start w:w="0" w:type="dxa"/>
+              <w:left w:w="0" w:type="dxa"/>
               <w:bottom w:w="180" w:type="dxa"/>
-              <w:end w:w="0" w:type="dxa"/>
+              <w:right w:w="0" w:type="dxa"/>
             </w:tcMar>
-            <w:tcBorders>
-              <w:top w:val="nil" w:sz="0" w:space="0" w:color="000000"/>
-              <w:start w:val="nil" w:sz="0" w:space="0" w:color="000000"/>
-              <w:bottom w:val="nil" w:sz="0" w:space="0" w:color="000000"/>
-              <w:end w:val="nil" w:sz="0" w:space="0" w:color="000000"/>
-              <w:insideH w:val="nil" w:sz="0" w:space="0" w:color="000000"/>
-              <w:insideV w:val="nil" w:sz="0" w:space="0" w:color="000000"/>
-            </w:tcBorders>
-            <w:vAlign w:val="top"/>
           </w:tcPr>
           <w:p>
             <w:pPr>
               <w:pStyle w:val="BodyText"/>
               <w:keepNext/>
               <w:keepLines/>
-              <w:spacing w:before="0" w:after="0" w:line="240" w:lineRule="auto"/>
-              <w:jc w:val="left"/>
-            </w:pPr>
-            <w:r>
-              <w:rPr>
-                <w:rFonts w:ascii="Arial MT" w:hAnsi="Arial MT"/>
-                <w:b w:val="0"/>
-                <w:sz w:val="24"/>
-              </w:rPr>
+            </w:pPr>
+            <w:r>
               <w:t>Demikian Surat Tugas ini dibuat untuk dilaksanakan dengan penuh tanggung jawab</w:t>
             </w:r>
           </w:p>
@@ -1575,40 +1564,28 @@
         </w:trPr>
         <w:tc>
           <w:tcPr>
-            <w:tcW w:type="dxa" w:w="5472"/>
+            <w:tcW w:w="5141" w:type="dxa"/>
+            <w:tcBorders>
+              <w:top w:val="nil"/>
+              <w:left w:val="nil"/>
+              <w:bottom w:val="nil"/>
+              <w:right w:val="nil"/>
+            </w:tcBorders>
             <w:tcMar>
               <w:top w:w="0" w:type="dxa"/>
-              <w:start w:w="0" w:type="dxa"/>
+              <w:left w:w="0" w:type="dxa"/>
               <w:bottom w:w="0" w:type="dxa"/>
-              <w:end w:w="216" w:type="dxa"/>
+              <w:right w:w="216" w:type="dxa"/>
             </w:tcMar>
-            <w:tcBorders>
-              <w:top w:val="nil" w:sz="0" w:space="0" w:color="000000"/>
-              <w:start w:val="nil" w:sz="0" w:space="0" w:color="000000"/>
-              <w:bottom w:val="nil" w:sz="0" w:space="0" w:color="000000"/>
-              <w:end w:val="nil" w:sz="0" w:space="0" w:color="000000"/>
-              <w:insideH w:val="nil" w:sz="0" w:space="0" w:color="000000"/>
-              <w:insideV w:val="nil" w:sz="0" w:space="0" w:color="000000"/>
-            </w:tcBorders>
-            <w:vAlign w:val="top"/>
           </w:tcPr>
           <w:p>
             <w:pPr>
-              <w:spacing w:before="0" w:after="0" w:line="20" w:lineRule="exact"/>
-            </w:pPr>
-            <w:r>
-              <w:rPr>
-                <w:sz w:val="2"/>
-              </w:rPr>
-            </w:r>
+              <w:spacing w:line="20" w:lineRule="exact"/>
+            </w:pPr>
           </w:p>
           <w:tbl>
             <w:tblPr>
-              <w:tblW w:type="dxa" w:w="5000"/>
-              <w:jc w:val="left"/>
-              <w:tblLayout w:type="fixed"/>
-              <w:tblLook w:firstColumn="1" w:firstRow="1" w:lastColumn="0" w:lastRow="0" w:noHBand="0" w:noVBand="1" w:val="04A0"/>
-              <w:tblInd w:type="dxa" w:w="0"/>
+              <w:tblW w:w="5000" w:type="dxa"/>
               <w:tblBorders>
                 <w:top w:val="single" w:sz="16" w:space="0" w:color="000000"/>
                 <w:left w:val="single" w:sz="16" w:space="0" w:color="000000"/>
@@ -1617,9 +1594,11 @@
                 <w:insideH w:val="single" w:sz="16" w:space="0" w:color="000000"/>
                 <w:insideV w:val="single" w:sz="16" w:space="0" w:color="000000"/>
               </w:tblBorders>
+              <w:tblLayout w:type="fixed"/>
+              <w:tblLook w:val="04A0" w:firstRow="1" w:lastRow="0" w:firstColumn="1" w:lastColumn="0" w:noHBand="0" w:noVBand="1"/>
             </w:tblPr>
             <w:tblGrid>
-              <w:gridCol w:w="5472"/>
+              <w:gridCol w:w="5000"/>
             </w:tblGrid>
             <w:tr>
               <w:trPr>
@@ -1627,33 +1606,28 @@
               </w:trPr>
               <w:tc>
                 <w:tcPr>
-                  <w:tcW w:type="dxa" w:w="5000"/>
+                  <w:tcW w:w="5000" w:type="dxa"/>
+                  <w:tcBorders>
+                    <w:top w:val="single" w:sz="16" w:space="0" w:color="000000"/>
+                    <w:left w:val="single" w:sz="16" w:space="0" w:color="000000"/>
+                    <w:bottom w:val="single" w:sz="16" w:space="0" w:color="000000"/>
+                    <w:right w:val="single" w:sz="16" w:space="0" w:color="000000"/>
+                  </w:tcBorders>
                   <w:tcMar>
                     <w:top w:w="90" w:type="dxa"/>
-                    <w:start w:w="120" w:type="dxa"/>
+                    <w:left w:w="120" w:type="dxa"/>
                     <w:bottom w:w="90" w:type="dxa"/>
-                    <w:end w:w="120" w:type="dxa"/>
+                    <w:right w:w="120" w:type="dxa"/>
                   </w:tcMar>
-                  <w:tcBorders>
-                    <w:top w:val="single" w:sz="16" w:space="0" w:color="000000"/>
-                    <w:start w:val="single" w:sz="16" w:space="0" w:color="000000"/>
-                    <w:bottom w:val="single" w:sz="16" w:space="0" w:color="000000"/>
-                    <w:end w:val="single" w:sz="16" w:space="0" w:color="000000"/>
-                    <w:insideH w:val="single" w:sz="16" w:space="0" w:color="000000"/>
-                    <w:insideV w:val="single" w:sz="16" w:space="0" w:color="000000"/>
-                  </w:tcBorders>
                 </w:tcPr>
                 <w:p>
                   <w:pPr>
                     <w:pStyle w:val="BodyText"/>
                     <w:keepNext/>
                     <w:keepLines/>
-                    <w:spacing w:before="0" w:after="0" w:line="240" w:lineRule="auto"/>
-                    <w:jc w:val="left"/>
                   </w:pPr>
                   <w:r>
                     <w:rPr>
-                      <w:rFonts w:ascii="Arial MT" w:hAnsi="Arial MT"/>
                       <w:b/>
                       <w:sz w:val="22"/>
                     </w:rPr>
@@ -1667,38 +1641,31 @@
         </w:tc>
         <w:tc>
           <w:tcPr>
-            <w:tcW w:type="dxa" w:w="4752"/>
+            <w:tcW w:w="4459" w:type="dxa"/>
+            <w:tcBorders>
+              <w:top w:val="nil"/>
+              <w:left w:val="nil"/>
+              <w:bottom w:val="nil"/>
+              <w:right w:val="nil"/>
+            </w:tcBorders>
             <w:tcMar>
               <w:top w:w="0" w:type="dxa"/>
-              <w:start w:w="0" w:type="dxa"/>
+              <w:left w:w="0" w:type="dxa"/>
               <w:bottom w:w="120" w:type="dxa"/>
-              <w:end w:w="0" w:type="dxa"/>
+              <w:right w:w="0" w:type="dxa"/>
             </w:tcMar>
-            <w:tcBorders>
-              <w:top w:val="nil" w:sz="0" w:space="0" w:color="000000"/>
-              <w:start w:val="nil" w:sz="0" w:space="0" w:color="000000"/>
-              <w:bottom w:val="nil" w:sz="0" w:space="0" w:color="000000"/>
-              <w:end w:val="nil" w:sz="0" w:space="0" w:color="000000"/>
-              <w:insideH w:val="nil" w:sz="0" w:space="0" w:color="000000"/>
-              <w:insideV w:val="nil" w:sz="0" w:space="0" w:color="000000"/>
-            </w:tcBorders>
-            <w:vAlign w:val="top"/>
           </w:tcPr>
           <w:p>
             <w:pPr>
               <w:pStyle w:val="BodyText"/>
               <w:keepNext/>
               <w:keepLines/>
-              <w:spacing w:before="0" w:after="0" w:line="240" w:lineRule="auto"/>
               <w:jc w:val="center"/>
             </w:pPr>
             <w:r>
-              <w:rPr>
-                <w:rFonts w:ascii="Arial MT" w:hAnsi="Arial MT"/>
-                <w:b w:val="0"/>
-                <w:sz w:val="24"/>
-              </w:rPr>
               <w:t>Pangkep, ${tanggal_surat}</w:t>
+            </w:r>
+            <w:r>
               <w:br/>
               <w:t>Kepala Balai,</w:t>
             </w:r>
@@ -1708,42 +1675,47 @@
               <w:pStyle w:val="BodyText"/>
               <w:keepNext/>
               <w:keepLines/>
-              <w:spacing w:before="600" w:after="840" w:line="240" w:lineRule="auto"/>
+              <w:spacing w:before="600" w:after="840"/>
               <w:jc w:val="center"/>
             </w:pPr>
             <w:r>
-              <w:rPr>
-                <w:rFonts w:ascii="Arial MT" w:hAnsi="Arial MT"/>
-                <w:b w:val="0"/>
-                <w:sz w:val="24"/>
-              </w:rPr>
               <w:t>${ttd}</w:t>
             </w:r>
           </w:p>
           <w:p>
             <w:pPr>
               <w:pStyle w:val="BodyText"/>
-              <w:keepNext w:val="0"/>
               <w:keepLines/>
-              <w:spacing w:before="0" w:after="0" w:line="240" w:lineRule="auto"/>
               <w:jc w:val="center"/>
             </w:pPr>
             <w:r>
-              <w:rPr>
-                <w:rFonts w:ascii="Arial MT" w:hAnsi="Arial MT"/>
-                <w:b w:val="0"/>
-                <w:sz w:val="24"/>
-              </w:rPr>
               <w:t>Ashari Arifuddin, S.T., M.M</w:t>
             </w:r>
           </w:p>
         </w:tc>
       </w:tr>
     </w:tbl>
+    <w:p/>
+    <w:p>
+      <w:pPr>
+        <w:pStyle w:val="TableParagraph"/>
+        <w:spacing w:line="229" w:lineRule="exact"/>
+        <w:ind w:left="107"/>
+        <w:rPr>
+          <w:spacing w:val="-5"/>
+          <w:sz w:val="20"/>
+        </w:rPr>
+        <w:sectPr>
+          <w:pgSz w:w="12240" w:h="18720"/>
+          <w:pgMar w:top="600" w:right="360" w:bottom="820" w:left="360" w:header="0" w:footer="639" w:gutter="0"/>
+          <w:cols w:space="720"/>
+        </w:sectPr>
+      </w:pPr>
+    </w:p>
     <w:tbl>
       <w:tblPr>
-        <w:tblW w:w="0" w:type="auto"/>
-        <w:tblInd w:w="502" w:type="dxa"/>
+        <w:tblW w:w="10224" w:type="dxa"/>
+        <w:tblInd w:w="648" w:type="dxa"/>
         <w:tblBorders>
           <w:top w:val="single" w:sz="4" w:space="0" w:color="000000"/>
           <w:left w:val="single" w:sz="4" w:space="0" w:color="000000"/>
@@ -1760,9 +1732,9 @@
         <w:tblLook w:val="01E0" w:firstRow="1" w:lastRow="1" w:firstColumn="1" w:lastColumn="1" w:noHBand="0" w:noVBand="0"/>
       </w:tblPr>
       <w:tblGrid>
-        <w:gridCol w:w="5309"/>
-        <w:gridCol w:w="2008"/>
-        <w:gridCol w:w="3572"/>
+        <w:gridCol w:w="4981"/>
+        <w:gridCol w:w="1888"/>
+        <w:gridCol w:w="3355"/>
       </w:tblGrid>
       <w:tr>
         <w:trPr>
@@ -2090,7 +2062,7 @@
                                 <pic:cNvPicPr/>
                               </pic:nvPicPr>
                               <pic:blipFill>
-                                <a:blip r:embed="rId15" cstate="print"/>
+                                <a:blip r:embed="rId14" cstate="print"/>
                                 <a:stretch>
                                   <a:fillRect/>
                                 </a:stretch>
@@ -4814,9 +4786,13 @@
               </wp:anchor>
             </w:drawing>
           </mc:Choice>
-          <mc:Fallback xmlns:w16cei="http://schemas.microsoft.com/office/word/2026/wordml/cei">
+          <mc:Fallback>
             <w:pict>
-              <v:shape w14:anchorId="43C63355" id="Textbox 22" o:spid="_x0000_s1029" type="#_x0000_t202" style="position:absolute;margin-left:413.75pt;margin-top:145pt;width:67.05pt;height:11.2pt;z-index:-15844352;visibility:visible;mso-wrap-style:square;mso-wrap-distance-left:0;mso-wrap-distance-top:0;mso-wrap-distance-right:0;mso-wrap-distance-bottom:0;mso-position-horizontal:absolute;mso-position-horizontal-relative:page;mso-position-vertical:absolute;mso-position-vertical-relative:page;v-text-anchor:top" o:gfxdata="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" filled="f" stroked="f">
+              <v:shapetype w14:anchorId="43C63355" id="_x0000_t202" coordsize="21600,21600" o:spt="202" path="m,l,21600r21600,l21600,xe">
+                <v:stroke joinstyle="miter"/>
+                <v:path gradientshapeok="t" o:connecttype="rect"/>
+              </v:shapetype>
+              <v:shape id="Textbox 22" o:spid="_x0000_s1026" type="#_x0000_t202" style="position:absolute;margin-left:413.75pt;margin-top:145pt;width:67.05pt;height:11.2pt;z-index:-15844352;visibility:visible;mso-wrap-style:square;mso-wrap-distance-left:0;mso-wrap-distance-top:0;mso-wrap-distance-right:0;mso-wrap-distance-bottom:0;mso-position-horizontal:absolute;mso-position-horizontal-relative:page;mso-position-vertical:absolute;mso-position-vertical-relative:page;v-text-anchor:top" o:gfxdata="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" filled="f" stroked="f">
                 <v:textbox inset="0,0,0,0">
                   <w:txbxContent>
                     <w:p>
@@ -4869,108 +4845,6 @@
     </w:p>
   </w:endnote>
 </w:endnotes>
-</file>
-
-<file path=word/footer1.xml><?xml version="1.0" encoding="utf-8"?>
-<w:ftr xmlns:wpc="http://schemas.microsoft.com/office/word/2010/wordprocessingCanvas" xmlns:cx="http://schemas.microsoft.com/office/drawing/2014/chartex" xmlns:cx1="http://schemas.microsoft.com/office/drawing/2015/9/8/chartex" xmlns:cx2="http://schemas.microsoft.com/office/drawing/2015/10/21/chartex" xmlns:cx3="http://schemas.microsoft.com/office/drawing/2016/5/9/chartex" xmlns:cx4="http://schemas.microsoft.com/office/drawing/2016/5/10/chartex" xmlns:cx5="http://schemas.microsoft.com/office/drawing/2016/5/11/chartex" xmlns:cx6="http://schemas.microsoft.com/office/drawing/2016/5/12/chartex" xmlns:cx7="http://schemas.microsoft.com/office/drawing/2016/5/13/chartex" xmlns:cx8="http://schemas.microsoft.com/office/drawing/2016/5/14/chartex" xmlns:mc="http://schemas.openxmlformats.org/markup-compatibility/2006" xmlns:aink="http://schemas.microsoft.com/office/drawing/2016/ink" xmlns:am3d="http://schemas.microsoft.com/office/drawing/2017/model3d" xmlns:o="urn:schemas-microsoft-com:office:office" xmlns:oel="http://schemas.microsoft.com/office/2019/extlst" xmlns:r="http://schemas.openxmlformats.org/officeDocument/2006/relationships" xmlns:m="http://schemas.openxmlformats.org/officeDocument/2006/math" xmlns:v="urn:schemas-microsoft-com:vml" xmlns:wp14="http://schemas.microsoft.com/office/word/2010/wordprocessingDrawing" xmlns:wp="http://schemas.openxmlformats.org/drawingml/2006/wordprocessingDrawing" xmlns:w10="urn:schemas-microsoft-com:office:word" xmlns:w="http://schemas.openxmlformats.org/wordprocessingml/2006/main" xmlns:w14="http://schemas.microsoft.com/office/word/2010/wordml" xmlns:w15="http://schemas.microsoft.com/office/word/2012/wordml" xmlns:w16cex="http://schemas.microsoft.com/office/word/2018/wordml/cex" xmlns:w16cid="http://schemas.microsoft.com/office/word/2016/wordml/cid" xmlns:w16="http://schemas.microsoft.com/office/word/2018/wordml" xmlns:w16du="http://schemas.microsoft.com/office/word/2023/wordml/word16du" xmlns:w16sdtdh="http://schemas.microsoft.com/office/word/2020/wordml/sdtdatahash" xmlns:w16sdtfl="http://schemas.microsoft.com/office/word/2024/wordml/sdtformatlock" xmlns:w16se="http://schemas.microsoft.com/office/word/2015/wordml/symex" xmlns:wpg="http://schemas.microsoft.com/office/word/2010/wordprocessingGroup" xmlns:wpi="http://schemas.microsoft.com/office/word/2010/wordprocessingInk" xmlns:wne="http://schemas.microsoft.com/office/word/2006/wordml" xmlns:wps="http://schemas.microsoft.com/office/word/2010/wordprocessingShape" mc:Ignorable="w14 w15 w16se w16cid w16 w16cex w16sdtdh w16sdtfl w16du wp14">
-  <w:p>
-    <w:pPr>
-      <w:pStyle w:val="BodyText"/>
-      <w:spacing w:line="14" w:lineRule="auto"/>
-      <w:rPr>
-        <w:sz w:val="20"/>
-      </w:rPr>
-    </w:pPr>
-    <w:r>
-      <w:rPr>
-        <w:noProof/>
-        <w:sz w:val="20"/>
-      </w:rPr>
-      <mc:AlternateContent>
-        <mc:Choice Requires="wps">
-          <w:drawing>
-            <wp:anchor distT="0" distB="0" distL="0" distR="0" simplePos="0" relativeHeight="487467520" behindDoc="1" locked="0" layoutInCell="1" allowOverlap="1" wp14:anchorId="71110E98" wp14:editId="3669C5BF">
-              <wp:simplePos x="0" y="0"/>
-              <wp:positionH relativeFrom="page">
-                <wp:posOffset>360045</wp:posOffset>
-              </wp:positionH>
-              <wp:positionV relativeFrom="page">
-                <wp:posOffset>11887200</wp:posOffset>
-              </wp:positionV>
-              <wp:extent cx="7052309" cy="1270"/>
-              <wp:effectExtent l="0" t="0" r="0" b="0"/>
-              <wp:wrapNone/>
-              <wp:docPr id="1" name="Graphic 1"/>
-              <wp:cNvGraphicFramePr>
-                <a:graphicFrameLocks xmlns:a="http://schemas.openxmlformats.org/drawingml/2006/main"/>
-              </wp:cNvGraphicFramePr>
-              <a:graphic xmlns:a="http://schemas.openxmlformats.org/drawingml/2006/main">
-                <a:graphicData uri="http://schemas.microsoft.com/office/word/2010/wordprocessingShape">
-                  <wps:wsp>
-                    <wps:cNvSpPr>
-                      <a:spLocks/>
-                    </wps:cNvSpPr>
-                    <wps:spPr>
-                      <a:xfrm>
-                        <a:off x="0" y="0"/>
-                        <a:ext cx="7052309" cy="1270"/>
-                      </a:xfrm>
-                      <a:custGeom>
-                        <a:avLst/>
-                        <a:gdLst/>
-                        <a:ahLst/>
-                        <a:cxnLst/>
-                        <a:rect l="l" t="t" r="r" b="b"/>
-                        <a:pathLst>
-                          <a:path w="7052309">
-                            <a:moveTo>
-                              <a:pt x="0" y="0"/>
-                            </a:moveTo>
-                            <a:lnTo>
-                              <a:pt x="7052309" y="0"/>
-                            </a:lnTo>
-                          </a:path>
-                          <a:path w="7052309">
-                            <a:moveTo>
-                              <a:pt x="0" y="0"/>
-                            </a:moveTo>
-                            <a:lnTo>
-                              <a:pt x="7052309" y="0"/>
-                            </a:lnTo>
-                          </a:path>
-                        </a:pathLst>
-                      </a:custGeom>
-                      <a:ln w="10795">
-                        <a:solidFill>
-                          <a:srgbClr val="000000"/>
-                        </a:solidFill>
-                        <a:prstDash val="solid"/>
-                      </a:ln>
-                    </wps:spPr>
-                    <wps:bodyPr wrap="square" lIns="0" tIns="0" rIns="0" bIns="0" rtlCol="0">
-                      <a:prstTxWarp prst="textNoShape">
-                        <a:avLst/>
-                      </a:prstTxWarp>
-                      <a:noAutofit/>
-                    </wps:bodyPr>
-                  </wps:wsp>
-                </a:graphicData>
-              </a:graphic>
-            </wp:anchor>
-          </w:drawing>
-        </mc:Choice>
-        <mc:Fallback xmlns:w16cei="http://schemas.microsoft.com/office/word/2026/wordml/cei">
-          <w:pict>
-            <v:shape w14:anchorId="6C379D08" id="Graphic 1" o:spid="_x0000_s1026" style="position:absolute;margin-left:28.35pt;margin-top:13in;width:555.3pt;height:.1pt;z-index:-15848960;visibility:visible;mso-wrap-style:square;mso-wrap-distance-left:0;mso-wrap-distance-top:0;mso-wrap-distance-right:0;mso-wrap-distance-bottom:0;mso-position-horizontal:absolute;mso-position-horizontal-relative:page;mso-position-vertical:absolute;mso-position-vertical-relative:page;v-text-anchor:top" coordsize="7052309,1270" o:gfxdata="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" path="m,l7052309,em,l7052309,e" filled="f" strokeweight=".85pt">
-              <v:path arrowok="t"/>
-              <w10:wrap anchorx="page" anchory="page"/>
-            </v:shape>
-          </w:pict>
-        </mc:Fallback>
-      </mc:AlternateContent>
-    </w:r>
-  </w:p>
-</w:ftr>
 </file>
 
 <file path=word/footnotes.xml><?xml version="1.0" encoding="utf-8"?>

</xml_diff>

<commit_message>
Menambahkan Fitur Petinjau Surat dan Pilihan Template
</commit_message>
<xml_diff>
--- a/resources/documents/Template_SPT_Perjadin_COLLECTIVE_V5.docx
+++ b/resources/documents/Template_SPT_Perjadin_COLLECTIVE_V5.docx
@@ -1495,21 +1495,9 @@
         </w:tc>
       </w:tr>
     </w:tbl>
-    <w:p>
-      <w:pPr>
-        <w:pStyle w:val="BodyText"/>
-      </w:pPr>
-    </w:p>
-    <w:p>
-      <w:pPr>
-        <w:pStyle w:val="BodyText"/>
-        <w:spacing w:before="56"/>
-      </w:pPr>
-    </w:p>
     <w:tbl>
       <w:tblPr>
-        <w:tblW w:w="9600" w:type="dxa"/>
-        <w:tblInd w:w="648" w:type="dxa"/>
+        <w:tblW w:w="11199" w:type="dxa"/>
         <w:tblBorders>
           <w:top w:val="nil"/>
           <w:left w:val="nil"/>
@@ -1522,49 +1510,21 @@
         <w:tblLook w:val="04A0" w:firstRow="1" w:lastRow="0" w:firstColumn="1" w:lastColumn="0" w:noHBand="0" w:noVBand="1"/>
       </w:tblPr>
       <w:tblGrid>
-        <w:gridCol w:w="5141"/>
-        <w:gridCol w:w="4459"/>
+        <w:gridCol w:w="4994"/>
+        <w:gridCol w:w="1892"/>
+        <w:gridCol w:w="4029"/>
+        <w:gridCol w:w="284"/>
       </w:tblGrid>
       <w:tr>
         <w:trPr>
+          <w:gridAfter w:val="1"/>
+          <w:wAfter w:w="284" w:type="dxa"/>
           <w:cantSplit/>
         </w:trPr>
         <w:tc>
           <w:tcPr>
-            <w:tcW w:w="9600" w:type="dxa"/>
-            <w:gridSpan w:val="2"/>
-            <w:tcBorders>
-              <w:top w:val="nil"/>
-              <w:left w:val="nil"/>
-              <w:bottom w:val="nil"/>
-              <w:right w:val="nil"/>
-            </w:tcBorders>
-            <w:tcMar>
-              <w:top w:w="0" w:type="dxa"/>
-              <w:left w:w="0" w:type="dxa"/>
-              <w:bottom w:w="180" w:type="dxa"/>
-              <w:right w:w="0" w:type="dxa"/>
-            </w:tcMar>
-          </w:tcPr>
-          <w:p>
-            <w:pPr>
-              <w:pStyle w:val="BodyText"/>
-              <w:keepNext/>
-              <w:keepLines/>
-            </w:pPr>
-            <w:r>
-              <w:t>Demikian Surat Tugas ini dibuat untuk dilaksanakan dengan penuh tanggung jawab</w:t>
-            </w:r>
-          </w:p>
-        </w:tc>
-      </w:tr>
-      <w:tr>
-        <w:trPr>
-          <w:cantSplit/>
-        </w:trPr>
-        <w:tc>
-          <w:tcPr>
-            <w:tcW w:w="5141" w:type="dxa"/>
+            <w:tcW w:w="10915" w:type="dxa"/>
+            <w:gridSpan w:val="3"/>
             <w:tcBorders>
               <w:top w:val="nil"/>
               <w:left w:val="nil"/>
@@ -1575,49 +1535,48 @@
               <w:top w:w="0" w:type="dxa"/>
               <w:left w:w="0" w:type="dxa"/>
               <w:bottom w:w="0" w:type="dxa"/>
-              <w:right w:w="216" w:type="dxa"/>
+              <w:right w:w="0" w:type="dxa"/>
             </w:tcMar>
           </w:tcPr>
-          <w:p>
-            <w:pPr>
-              <w:spacing w:line="20" w:lineRule="exact"/>
-            </w:pPr>
-          </w:p>
           <w:tbl>
             <w:tblPr>
-              <w:tblW w:w="5000" w:type="dxa"/>
+              <w:tblW w:w="10267" w:type="dxa"/>
+              <w:jc w:val="center"/>
               <w:tblBorders>
-                <w:top w:val="single" w:sz="16" w:space="0" w:color="000000"/>
-                <w:left w:val="single" w:sz="16" w:space="0" w:color="000000"/>
-                <w:bottom w:val="single" w:sz="16" w:space="0" w:color="000000"/>
-                <w:right w:val="single" w:sz="16" w:space="0" w:color="000000"/>
-                <w:insideH w:val="single" w:sz="16" w:space="0" w:color="000000"/>
-                <w:insideV w:val="single" w:sz="16" w:space="0" w:color="000000"/>
+                <w:top w:val="nil"/>
+                <w:left w:val="nil"/>
+                <w:bottom w:val="nil"/>
+                <w:right w:val="nil"/>
+                <w:insideH w:val="nil"/>
+                <w:insideV w:val="nil"/>
               </w:tblBorders>
               <w:tblLayout w:type="fixed"/>
               <w:tblLook w:val="04A0" w:firstRow="1" w:lastRow="0" w:firstColumn="1" w:lastColumn="0" w:noHBand="0" w:noVBand="1"/>
             </w:tblPr>
             <w:tblGrid>
-              <w:gridCol w:w="5000"/>
+              <w:gridCol w:w="5141"/>
+              <w:gridCol w:w="5126"/>
             </w:tblGrid>
             <w:tr>
               <w:trPr>
                 <w:cantSplit/>
+                <w:jc w:val="center"/>
               </w:trPr>
               <w:tc>
                 <w:tcPr>
-                  <w:tcW w:w="5000" w:type="dxa"/>
+                  <w:tcW w:w="10267" w:type="dxa"/>
+                  <w:gridSpan w:val="2"/>
                   <w:tcBorders>
-                    <w:top w:val="single" w:sz="16" w:space="0" w:color="000000"/>
-                    <w:left w:val="single" w:sz="16" w:space="0" w:color="000000"/>
-                    <w:bottom w:val="single" w:sz="16" w:space="0" w:color="000000"/>
-                    <w:right w:val="single" w:sz="16" w:space="0" w:color="000000"/>
+                    <w:top w:val="nil"/>
+                    <w:left w:val="nil"/>
+                    <w:bottom w:val="nil"/>
+                    <w:right w:val="nil"/>
                   </w:tcBorders>
                   <w:tcMar>
-                    <w:top w:w="90" w:type="dxa"/>
-                    <w:left w:w="120" w:type="dxa"/>
-                    <w:bottom w:w="90" w:type="dxa"/>
-                    <w:right w:w="120" w:type="dxa"/>
+                    <w:top w:w="0" w:type="dxa"/>
+                    <w:left w:w="0" w:type="dxa"/>
+                    <w:bottom w:w="180" w:type="dxa"/>
+                    <w:right w:w="0" w:type="dxa"/>
                   </w:tcMar>
                 </w:tcPr>
                 <w:p>
@@ -1625,128 +1584,223 @@
                     <w:pStyle w:val="BodyText"/>
                     <w:keepNext/>
                     <w:keepLines/>
+                    <w:tabs>
+                      <w:tab w:val="left" w:pos="0"/>
+                      <w:tab w:val="left" w:pos="273"/>
+                    </w:tabs>
+                    <w:spacing w:before="160"/>
                   </w:pPr>
                   <w:r>
-                    <w:rPr>
-                      <w:b/>
-                      <w:sz w:val="22"/>
-                    </w:rPr>
-                    <w:t>Pelaksana yang ditugaskan oleh BPVP Pangkep tidak menerima gratifikasi dalam bentuk apapun sesuai ketentuan yang berlaku</w:t>
+                    <w:lastRenderedPageBreak/>
+                    <w:t>Demikian Surat Tugas ini dibuat untuk dilaksanakan dengan penuh tanggung jawab</w:t>
+                  </w:r>
+                </w:p>
+              </w:tc>
+            </w:tr>
+            <w:tr>
+              <w:trPr>
+                <w:cantSplit/>
+                <w:jc w:val="center"/>
+              </w:trPr>
+              <w:tc>
+                <w:tcPr>
+                  <w:tcW w:w="5141" w:type="dxa"/>
+                  <w:tcBorders>
+                    <w:top w:val="nil"/>
+                    <w:left w:val="nil"/>
+                    <w:bottom w:val="nil"/>
+                    <w:right w:val="nil"/>
+                  </w:tcBorders>
+                  <w:tcMar>
+                    <w:top w:w="0" w:type="dxa"/>
+                    <w:left w:w="0" w:type="dxa"/>
+                    <w:bottom w:w="0" w:type="dxa"/>
+                    <w:right w:w="216" w:type="dxa"/>
+                  </w:tcMar>
+                </w:tcPr>
+                <w:p>
+                  <w:pPr>
+                    <w:tabs>
+                      <w:tab w:val="left" w:pos="0"/>
+                      <w:tab w:val="left" w:pos="273"/>
+                    </w:tabs>
+                    <w:spacing w:line="20" w:lineRule="exact"/>
+                  </w:pPr>
+                </w:p>
+                <w:tbl>
+                  <w:tblPr>
+                    <w:tblW w:w="5000" w:type="dxa"/>
+                    <w:tblBorders>
+                      <w:top w:val="single" w:sz="16" w:space="0" w:color="000000"/>
+                      <w:left w:val="single" w:sz="16" w:space="0" w:color="000000"/>
+                      <w:bottom w:val="single" w:sz="16" w:space="0" w:color="000000"/>
+                      <w:right w:val="single" w:sz="16" w:space="0" w:color="000000"/>
+                      <w:insideH w:val="single" w:sz="16" w:space="0" w:color="000000"/>
+                      <w:insideV w:val="single" w:sz="16" w:space="0" w:color="000000"/>
+                    </w:tblBorders>
+                    <w:tblLayout w:type="fixed"/>
+                    <w:tblLook w:val="04A0" w:firstRow="1" w:lastRow="0" w:firstColumn="1" w:lastColumn="0" w:noHBand="0" w:noVBand="1"/>
+                  </w:tblPr>
+                  <w:tblGrid>
+                    <w:gridCol w:w="5000"/>
+                  </w:tblGrid>
+                  <w:tr>
+                    <w:trPr>
+                      <w:cantSplit/>
+                    </w:trPr>
+                    <w:tc>
+                      <w:tcPr>
+                        <w:tcW w:w="5000" w:type="dxa"/>
+                        <w:tcBorders>
+                          <w:top w:val="single" w:sz="16" w:space="0" w:color="000000"/>
+                          <w:left w:val="single" w:sz="16" w:space="0" w:color="000000"/>
+                          <w:bottom w:val="single" w:sz="16" w:space="0" w:color="000000"/>
+                          <w:right w:val="single" w:sz="16" w:space="0" w:color="000000"/>
+                        </w:tcBorders>
+                        <w:tcMar>
+                          <w:top w:w="90" w:type="dxa"/>
+                          <w:left w:w="120" w:type="dxa"/>
+                          <w:bottom w:w="90" w:type="dxa"/>
+                          <w:right w:w="120" w:type="dxa"/>
+                        </w:tcMar>
+                      </w:tcPr>
+                      <w:p>
+                        <w:pPr>
+                          <w:pStyle w:val="BodyText"/>
+                          <w:keepNext/>
+                          <w:keepLines/>
+                          <w:tabs>
+                            <w:tab w:val="left" w:pos="0"/>
+                            <w:tab w:val="left" w:pos="273"/>
+                          </w:tabs>
+                        </w:pPr>
+                        <w:r>
+                          <w:rPr>
+                            <w:b/>
+                            <w:sz w:val="22"/>
+                          </w:rPr>
+                          <w:t>Pelaksana yang ditugaskan oleh BPVP Pangkep tidak menerima gratifikasi dalam bentuk apapun sesuai ketentuan yang berlaku</w:t>
+                        </w:r>
+                      </w:p>
+                    </w:tc>
+                  </w:tr>
+                </w:tbl>
+                <w:p>
+                  <w:pPr>
+                    <w:tabs>
+                      <w:tab w:val="left" w:pos="0"/>
+                      <w:tab w:val="left" w:pos="273"/>
+                    </w:tabs>
+                  </w:pPr>
+                </w:p>
+              </w:tc>
+              <w:tc>
+                <w:tcPr>
+                  <w:tcW w:w="5126" w:type="dxa"/>
+                  <w:tcBorders>
+                    <w:top w:val="nil"/>
+                    <w:left w:val="nil"/>
+                    <w:bottom w:val="nil"/>
+                    <w:right w:val="nil"/>
+                  </w:tcBorders>
+                  <w:tcMar>
+                    <w:top w:w="0" w:type="dxa"/>
+                    <w:left w:w="0" w:type="dxa"/>
+                    <w:bottom w:w="120" w:type="dxa"/>
+                    <w:right w:w="0" w:type="dxa"/>
+                  </w:tcMar>
+                </w:tcPr>
+                <w:p>
+                  <w:pPr>
+                    <w:pStyle w:val="BodyText"/>
+                    <w:keepNext/>
+                    <w:keepLines/>
+                    <w:tabs>
+                      <w:tab w:val="left" w:pos="0"/>
+                    </w:tabs>
+                    <w:ind w:left="2160"/>
+                    <w:jc w:val="center"/>
+                  </w:pPr>
+                  <w:r>
+                    <w:t>Pangkep, ${tanggal_surat}</w:t>
+                  </w:r>
+                  <w:r>
+                    <w:br/>
+                    <w:t>Kepala Balai,</w:t>
+                  </w:r>
+                </w:p>
+                <w:p>
+                  <w:pPr>
+                    <w:pStyle w:val="BodyText"/>
+                    <w:keepNext/>
+                    <w:keepLines/>
+                    <w:tabs>
+                      <w:tab w:val="left" w:pos="0"/>
+                      <w:tab w:val="left" w:pos="273"/>
+                    </w:tabs>
+                    <w:spacing w:before="240" w:after="240"/>
+                    <w:ind w:left="2160"/>
+                    <w:jc w:val="center"/>
+                  </w:pPr>
+                  <w:r>
+                    <w:t>${ttd}</w:t>
+                  </w:r>
+                </w:p>
+                <w:p>
+                  <w:pPr>
+                    <w:pStyle w:val="BodyText"/>
+                    <w:keepLines/>
+                    <w:tabs>
+                      <w:tab w:val="left" w:pos="0"/>
+                      <w:tab w:val="left" w:pos="273"/>
+                    </w:tabs>
+                    <w:spacing w:after="160"/>
+                    <w:ind w:left="2160"/>
+                    <w:jc w:val="center"/>
+                  </w:pPr>
+                  <w:r>
+                    <w:t>Ashari Ariuddin, S.T., M.M</w:t>
                   </w:r>
                 </w:p>
               </w:tc>
             </w:tr>
           </w:tbl>
-          <w:p/>
-        </w:tc>
-        <w:tc>
-          <w:tcPr>
-            <w:tcW w:w="4459" w:type="dxa"/>
-            <w:tcBorders>
-              <w:top w:val="nil"/>
-              <w:left w:val="nil"/>
-              <w:bottom w:val="nil"/>
-              <w:right w:val="nil"/>
-            </w:tcBorders>
-            <w:tcMar>
-              <w:top w:w="0" w:type="dxa"/>
-              <w:left w:w="0" w:type="dxa"/>
-              <w:bottom w:w="120" w:type="dxa"/>
-              <w:right w:w="0" w:type="dxa"/>
-            </w:tcMar>
-          </w:tcPr>
-          <w:p>
-            <w:pPr>
-              <w:pStyle w:val="BodyText"/>
-              <w:keepNext/>
-              <w:keepLines/>
-              <w:jc w:val="center"/>
-            </w:pPr>
-            <w:r>
-              <w:t>Pangkep, ${tanggal_surat}</w:t>
-            </w:r>
-            <w:r>
-              <w:br/>
-              <w:t>Kepala Balai,</w:t>
-            </w:r>
-          </w:p>
-          <w:p>
-            <w:pPr>
-              <w:pStyle w:val="BodyText"/>
-              <w:keepNext/>
-              <w:keepLines/>
-              <w:spacing w:before="600" w:after="840"/>
-              <w:jc w:val="center"/>
-            </w:pPr>
-            <w:r>
-              <w:t>${ttd}</w:t>
-            </w:r>
-          </w:p>
-          <w:p>
-            <w:pPr>
-              <w:pStyle w:val="BodyText"/>
-              <w:keepLines/>
-              <w:jc w:val="center"/>
-            </w:pPr>
-            <w:r>
-              <w:t>Ashari Arifuddin, S.T., M.M</w:t>
-            </w:r>
+          <w:p>
+            <w:pPr>
+              <w:spacing w:line="20" w:lineRule="exact"/>
+            </w:pPr>
           </w:p>
         </w:tc>
       </w:tr>
-    </w:tbl>
-    <w:p/>
-    <w:p>
-      <w:pPr>
-        <w:pStyle w:val="TableParagraph"/>
-        <w:spacing w:line="229" w:lineRule="exact"/>
-        <w:ind w:left="107"/>
-        <w:rPr>
-          <w:spacing w:val="-5"/>
-          <w:sz w:val="20"/>
-        </w:rPr>
-        <w:sectPr>
-          <w:pgSz w:w="12240" w:h="18720"/>
-          <w:pgMar w:top="600" w:right="360" w:bottom="820" w:left="360" w:header="0" w:footer="639" w:gutter="0"/>
-          <w:cols w:space="720"/>
-        </w:sectPr>
-      </w:pPr>
-    </w:p>
-    <w:tbl>
-      <w:tblPr>
-        <w:tblW w:w="10224" w:type="dxa"/>
-        <w:tblInd w:w="648" w:type="dxa"/>
-        <w:tblBorders>
-          <w:top w:val="single" w:sz="4" w:space="0" w:color="000000"/>
-          <w:left w:val="single" w:sz="4" w:space="0" w:color="000000"/>
-          <w:bottom w:val="single" w:sz="4" w:space="0" w:color="000000"/>
-          <w:right w:val="single" w:sz="4" w:space="0" w:color="000000"/>
-          <w:insideH w:val="single" w:sz="4" w:space="0" w:color="000000"/>
-          <w:insideV w:val="single" w:sz="4" w:space="0" w:color="000000"/>
-        </w:tblBorders>
-        <w:tblLayout w:type="fixed"/>
-        <w:tblCellMar>
-          <w:left w:w="0" w:type="dxa"/>
-          <w:right w:w="0" w:type="dxa"/>
-        </w:tblCellMar>
-        <w:tblLook w:val="01E0" w:firstRow="1" w:lastRow="1" w:firstColumn="1" w:lastColumn="1" w:noHBand="0" w:noVBand="0"/>
-      </w:tblPr>
-      <w:tblGrid>
-        <w:gridCol w:w="4981"/>
-        <w:gridCol w:w="1888"/>
-        <w:gridCol w:w="3355"/>
-      </w:tblGrid>
       <w:tr>
+        <w:tblPrEx>
+          <w:tblBorders>
+            <w:top w:val="single" w:sz="4" w:space="0" w:color="000000"/>
+            <w:left w:val="single" w:sz="4" w:space="0" w:color="000000"/>
+            <w:bottom w:val="single" w:sz="4" w:space="0" w:color="000000"/>
+            <w:right w:val="single" w:sz="4" w:space="0" w:color="000000"/>
+            <w:insideH w:val="single" w:sz="4" w:space="0" w:color="000000"/>
+            <w:insideV w:val="single" w:sz="4" w:space="0" w:color="000000"/>
+          </w:tblBorders>
+          <w:tblCellMar>
+            <w:left w:w="0" w:type="dxa"/>
+            <w:right w:w="0" w:type="dxa"/>
+          </w:tblCellMar>
+          <w:tblLook w:val="01E0" w:firstRow="1" w:lastRow="1" w:firstColumn="1" w:lastColumn="1" w:noHBand="0" w:noVBand="0"/>
+        </w:tblPrEx>
         <w:trPr>
+          <w:cantSplit/>
           <w:trHeight w:val="3694"/>
         </w:trPr>
         <w:tc>
           <w:tcPr>
-            <w:tcW w:w="5309" w:type="dxa"/>
+            <w:tcW w:w="4994" w:type="dxa"/>
           </w:tcPr>
           <w:p>
             <w:pPr>
               <w:pStyle w:val="TableParagraph"/>
+              <w:keepNext/>
+              <w:keepLines/>
               <w:spacing w:line="229" w:lineRule="exact"/>
               <w:ind w:left="107"/>
               <w:rPr>
@@ -1758,19 +1812,20 @@
                 <w:spacing w:val="-5"/>
                 <w:sz w:val="20"/>
               </w:rPr>
-              <w:lastRenderedPageBreak/>
               <w:t>I.</w:t>
             </w:r>
           </w:p>
         </w:tc>
         <w:tc>
           <w:tcPr>
-            <w:tcW w:w="5580" w:type="dxa"/>
-            <w:gridSpan w:val="2"/>
+            <w:tcW w:w="6205" w:type="dxa"/>
+            <w:gridSpan w:val="3"/>
           </w:tcPr>
           <w:p>
             <w:pPr>
               <w:pStyle w:val="TableParagraph"/>
+              <w:keepNext/>
+              <w:keepLines/>
               <w:tabs>
                 <w:tab w:val="left" w:pos="2264"/>
               </w:tabs>
@@ -1829,6 +1884,8 @@
           <w:p>
             <w:pPr>
               <w:pStyle w:val="TableParagraph"/>
+              <w:keepNext/>
+              <w:keepLines/>
               <w:tabs>
                 <w:tab w:val="left" w:pos="2264"/>
               </w:tabs>
@@ -1875,6 +1932,8 @@
           <w:p>
             <w:pPr>
               <w:pStyle w:val="TableParagraph"/>
+              <w:keepNext/>
+              <w:keepLines/>
               <w:tabs>
                 <w:tab w:val="left" w:pos="2264"/>
               </w:tabs>
@@ -1921,6 +1980,8 @@
           <w:p>
             <w:pPr>
               <w:pStyle w:val="TableParagraph"/>
+              <w:keepNext/>
+              <w:keepLines/>
               <w:tabs>
                 <w:tab w:val="left" w:pos="2264"/>
               </w:tabs>
@@ -1975,30 +2036,38 @@
           <w:p>
             <w:pPr>
               <w:pStyle w:val="TableParagraph"/>
-              <w:rPr>
-                <w:sz w:val="20"/>
-              </w:rPr>
-            </w:pPr>
-          </w:p>
-          <w:p>
-            <w:pPr>
-              <w:pStyle w:val="TableParagraph"/>
-              <w:rPr>
-                <w:sz w:val="20"/>
-              </w:rPr>
-            </w:pPr>
-          </w:p>
-          <w:p>
-            <w:pPr>
-              <w:pStyle w:val="TableParagraph"/>
-              <w:rPr>
-                <w:sz w:val="20"/>
-              </w:rPr>
-            </w:pPr>
-          </w:p>
-          <w:p>
-            <w:pPr>
-              <w:pStyle w:val="TableParagraph"/>
+              <w:keepNext/>
+              <w:keepLines/>
+              <w:rPr>
+                <w:sz w:val="20"/>
+              </w:rPr>
+            </w:pPr>
+          </w:p>
+          <w:p>
+            <w:pPr>
+              <w:pStyle w:val="TableParagraph"/>
+              <w:keepNext/>
+              <w:keepLines/>
+              <w:rPr>
+                <w:sz w:val="20"/>
+              </w:rPr>
+            </w:pPr>
+          </w:p>
+          <w:p>
+            <w:pPr>
+              <w:pStyle w:val="TableParagraph"/>
+              <w:keepNext/>
+              <w:keepLines/>
+              <w:rPr>
+                <w:sz w:val="20"/>
+              </w:rPr>
+            </w:pPr>
+          </w:p>
+          <w:p>
+            <w:pPr>
+              <w:pStyle w:val="TableParagraph"/>
+              <w:keepNext/>
+              <w:keepLines/>
               <w:spacing w:before="13"/>
               <w:rPr>
                 <w:sz w:val="20"/>
@@ -2008,6 +2077,8 @@
           <w:p>
             <w:pPr>
               <w:pStyle w:val="TableParagraph"/>
+              <w:keepNext/>
+              <w:keepLines/>
               <w:tabs>
                 <w:tab w:val="left" w:pos="1459"/>
               </w:tabs>
@@ -2218,22 +2289,28 @@
           <w:p>
             <w:pPr>
               <w:pStyle w:val="TableParagraph"/>
-              <w:rPr>
-                <w:sz w:val="20"/>
-              </w:rPr>
-            </w:pPr>
-          </w:p>
-          <w:p>
-            <w:pPr>
-              <w:pStyle w:val="TableParagraph"/>
-              <w:rPr>
-                <w:sz w:val="20"/>
-              </w:rPr>
-            </w:pPr>
-          </w:p>
-          <w:p>
-            <w:pPr>
-              <w:pStyle w:val="TableParagraph"/>
+              <w:keepNext/>
+              <w:keepLines/>
+              <w:rPr>
+                <w:sz w:val="20"/>
+              </w:rPr>
+            </w:pPr>
+          </w:p>
+          <w:p>
+            <w:pPr>
+              <w:pStyle w:val="TableParagraph"/>
+              <w:keepNext/>
+              <w:keepLines/>
+              <w:rPr>
+                <w:sz w:val="20"/>
+              </w:rPr>
+            </w:pPr>
+          </w:p>
+          <w:p>
+            <w:pPr>
+              <w:pStyle w:val="TableParagraph"/>
+              <w:keepNext/>
+              <w:keepLines/>
               <w:spacing w:before="26"/>
               <w:rPr>
                 <w:sz w:val="20"/>
@@ -2243,6 +2320,8 @@
           <w:p>
             <w:pPr>
               <w:pStyle w:val="TableParagraph"/>
+              <w:keepNext/>
+              <w:keepLines/>
               <w:spacing w:line="228" w:lineRule="exact"/>
               <w:ind w:left="1559" w:right="1228" w:firstLine="4"/>
               <w:rPr>
@@ -2318,16 +2397,34 @@
         </w:tc>
       </w:tr>
       <w:tr>
+        <w:tblPrEx>
+          <w:tblBorders>
+            <w:top w:val="single" w:sz="4" w:space="0" w:color="000000"/>
+            <w:left w:val="single" w:sz="4" w:space="0" w:color="000000"/>
+            <w:bottom w:val="single" w:sz="4" w:space="0" w:color="000000"/>
+            <w:right w:val="single" w:sz="4" w:space="0" w:color="000000"/>
+            <w:insideH w:val="single" w:sz="4" w:space="0" w:color="000000"/>
+            <w:insideV w:val="single" w:sz="4" w:space="0" w:color="000000"/>
+          </w:tblBorders>
+          <w:tblCellMar>
+            <w:left w:w="0" w:type="dxa"/>
+            <w:right w:w="0" w:type="dxa"/>
+          </w:tblCellMar>
+          <w:tblLook w:val="01E0" w:firstRow="1" w:lastRow="1" w:firstColumn="1" w:lastColumn="1" w:noHBand="0" w:noVBand="0"/>
+        </w:tblPrEx>
         <w:trPr>
+          <w:cantSplit/>
           <w:trHeight w:val="2506"/>
         </w:trPr>
         <w:tc>
           <w:tcPr>
-            <w:tcW w:w="5309" w:type="dxa"/>
+            <w:tcW w:w="4994" w:type="dxa"/>
           </w:tcPr>
           <w:p>
             <w:pPr>
               <w:pStyle w:val="TableParagraph"/>
+              <w:keepNext/>
+              <w:keepLines/>
               <w:tabs>
                 <w:tab w:val="left" w:pos="1980"/>
               </w:tabs>
@@ -2388,6 +2485,8 @@
           <w:p>
             <w:pPr>
               <w:pStyle w:val="TableParagraph"/>
+              <w:keepNext/>
+              <w:keepLines/>
               <w:tabs>
                 <w:tab w:val="left" w:pos="1620"/>
               </w:tabs>
@@ -2428,6 +2527,8 @@
           <w:p>
             <w:pPr>
               <w:pStyle w:val="TableParagraph"/>
+              <w:keepNext/>
+              <w:keepLines/>
               <w:tabs>
                 <w:tab w:val="left" w:pos="1628"/>
               </w:tabs>
@@ -2462,38 +2563,48 @@
           <w:p>
             <w:pPr>
               <w:pStyle w:val="TableParagraph"/>
-              <w:rPr>
-                <w:sz w:val="20"/>
-              </w:rPr>
-            </w:pPr>
-          </w:p>
-          <w:p>
-            <w:pPr>
-              <w:pStyle w:val="TableParagraph"/>
-              <w:rPr>
-                <w:sz w:val="20"/>
-              </w:rPr>
-            </w:pPr>
-          </w:p>
-          <w:p>
-            <w:pPr>
-              <w:pStyle w:val="TableParagraph"/>
-              <w:rPr>
-                <w:sz w:val="20"/>
-              </w:rPr>
-            </w:pPr>
-          </w:p>
-          <w:p>
-            <w:pPr>
-              <w:pStyle w:val="TableParagraph"/>
-              <w:rPr>
-                <w:sz w:val="20"/>
-              </w:rPr>
-            </w:pPr>
-          </w:p>
-          <w:p>
-            <w:pPr>
-              <w:pStyle w:val="TableParagraph"/>
+              <w:keepNext/>
+              <w:keepLines/>
+              <w:rPr>
+                <w:sz w:val="20"/>
+              </w:rPr>
+            </w:pPr>
+          </w:p>
+          <w:p>
+            <w:pPr>
+              <w:pStyle w:val="TableParagraph"/>
+              <w:keepNext/>
+              <w:keepLines/>
+              <w:rPr>
+                <w:sz w:val="20"/>
+              </w:rPr>
+            </w:pPr>
+          </w:p>
+          <w:p>
+            <w:pPr>
+              <w:pStyle w:val="TableParagraph"/>
+              <w:keepNext/>
+              <w:keepLines/>
+              <w:rPr>
+                <w:sz w:val="20"/>
+              </w:rPr>
+            </w:pPr>
+          </w:p>
+          <w:p>
+            <w:pPr>
+              <w:pStyle w:val="TableParagraph"/>
+              <w:keepNext/>
+              <w:keepLines/>
+              <w:rPr>
+                <w:sz w:val="20"/>
+              </w:rPr>
+            </w:pPr>
+          </w:p>
+          <w:p>
+            <w:pPr>
+              <w:pStyle w:val="TableParagraph"/>
+              <w:keepNext/>
+              <w:keepLines/>
               <w:spacing w:before="1"/>
               <w:rPr>
                 <w:sz w:val="20"/>
@@ -2503,6 +2614,8 @@
           <w:p>
             <w:pPr>
               <w:pStyle w:val="TableParagraph"/>
+              <w:keepNext/>
+              <w:keepLines/>
               <w:tabs>
                 <w:tab w:val="left" w:pos="4177"/>
               </w:tabs>
@@ -2543,12 +2656,14 @@
         </w:tc>
         <w:tc>
           <w:tcPr>
-            <w:tcW w:w="5580" w:type="dxa"/>
-            <w:gridSpan w:val="2"/>
+            <w:tcW w:w="6205" w:type="dxa"/>
+            <w:gridSpan w:val="3"/>
           </w:tcPr>
           <w:p>
             <w:pPr>
               <w:pStyle w:val="TableParagraph"/>
+              <w:keepNext/>
+              <w:keepLines/>
               <w:tabs>
                 <w:tab w:val="left" w:pos="2264"/>
               </w:tabs>
@@ -2595,6 +2710,8 @@
           <w:p>
             <w:pPr>
               <w:pStyle w:val="TableParagraph"/>
+              <w:keepNext/>
+              <w:keepLines/>
               <w:tabs>
                 <w:tab w:val="left" w:pos="2264"/>
               </w:tabs>
@@ -2642,6 +2759,8 @@
           <w:p>
             <w:pPr>
               <w:pStyle w:val="TableParagraph"/>
+              <w:keepNext/>
+              <w:keepLines/>
               <w:tabs>
                 <w:tab w:val="left" w:pos="2264"/>
               </w:tabs>
@@ -2676,6 +2795,8 @@
           <w:p>
             <w:pPr>
               <w:pStyle w:val="TableParagraph"/>
+              <w:keepNext/>
+              <w:keepLines/>
               <w:tabs>
                 <w:tab w:val="left" w:pos="2288"/>
               </w:tabs>
@@ -2709,22 +2830,28 @@
           <w:p>
             <w:pPr>
               <w:pStyle w:val="TableParagraph"/>
-              <w:rPr>
-                <w:sz w:val="20"/>
-              </w:rPr>
-            </w:pPr>
-          </w:p>
-          <w:p>
-            <w:pPr>
-              <w:pStyle w:val="TableParagraph"/>
-              <w:rPr>
-                <w:sz w:val="20"/>
-              </w:rPr>
-            </w:pPr>
-          </w:p>
-          <w:p>
-            <w:pPr>
-              <w:pStyle w:val="TableParagraph"/>
+              <w:keepNext/>
+              <w:keepLines/>
+              <w:rPr>
+                <w:sz w:val="20"/>
+              </w:rPr>
+            </w:pPr>
+          </w:p>
+          <w:p>
+            <w:pPr>
+              <w:pStyle w:val="TableParagraph"/>
+              <w:keepNext/>
+              <w:keepLines/>
+              <w:rPr>
+                <w:sz w:val="20"/>
+              </w:rPr>
+            </w:pPr>
+          </w:p>
+          <w:p>
+            <w:pPr>
+              <w:pStyle w:val="TableParagraph"/>
+              <w:keepNext/>
+              <w:keepLines/>
               <w:spacing w:before="211"/>
               <w:rPr>
                 <w:sz w:val="20"/>
@@ -2734,6 +2861,8 @@
           <w:p>
             <w:pPr>
               <w:pStyle w:val="TableParagraph"/>
+              <w:keepNext/>
+              <w:keepLines/>
               <w:tabs>
                 <w:tab w:val="left" w:pos="4510"/>
               </w:tabs>
@@ -2782,16 +2911,34 @@
         </w:tc>
       </w:tr>
       <w:tr>
+        <w:tblPrEx>
+          <w:tblBorders>
+            <w:top w:val="single" w:sz="4" w:space="0" w:color="000000"/>
+            <w:left w:val="single" w:sz="4" w:space="0" w:color="000000"/>
+            <w:bottom w:val="single" w:sz="4" w:space="0" w:color="000000"/>
+            <w:right w:val="single" w:sz="4" w:space="0" w:color="000000"/>
+            <w:insideH w:val="single" w:sz="4" w:space="0" w:color="000000"/>
+            <w:insideV w:val="single" w:sz="4" w:space="0" w:color="000000"/>
+          </w:tblBorders>
+          <w:tblCellMar>
+            <w:left w:w="0" w:type="dxa"/>
+            <w:right w:w="0" w:type="dxa"/>
+          </w:tblCellMar>
+          <w:tblLook w:val="01E0" w:firstRow="1" w:lastRow="1" w:firstColumn="1" w:lastColumn="1" w:noHBand="0" w:noVBand="0"/>
+        </w:tblPrEx>
         <w:trPr>
+          <w:cantSplit/>
           <w:trHeight w:val="2670"/>
         </w:trPr>
         <w:tc>
           <w:tcPr>
-            <w:tcW w:w="5309" w:type="dxa"/>
+            <w:tcW w:w="4994" w:type="dxa"/>
           </w:tcPr>
           <w:p>
             <w:pPr>
               <w:pStyle w:val="TableParagraph"/>
+              <w:keepNext/>
+              <w:keepLines/>
               <w:tabs>
                 <w:tab w:val="left" w:pos="2087"/>
               </w:tabs>
@@ -2851,6 +2998,8 @@
           <w:p>
             <w:pPr>
               <w:pStyle w:val="TableParagraph"/>
+              <w:keepNext/>
+              <w:keepLines/>
               <w:tabs>
                 <w:tab w:val="left" w:pos="2087"/>
               </w:tabs>
@@ -2890,6 +3039,8 @@
           <w:p>
             <w:pPr>
               <w:pStyle w:val="TableParagraph"/>
+              <w:keepNext/>
+              <w:keepLines/>
               <w:tabs>
                 <w:tab w:val="left" w:pos="2087"/>
               </w:tabs>
@@ -2923,38 +3074,48 @@
           <w:p>
             <w:pPr>
               <w:pStyle w:val="TableParagraph"/>
-              <w:rPr>
-                <w:sz w:val="20"/>
-              </w:rPr>
-            </w:pPr>
-          </w:p>
-          <w:p>
-            <w:pPr>
-              <w:pStyle w:val="TableParagraph"/>
-              <w:rPr>
-                <w:sz w:val="20"/>
-              </w:rPr>
-            </w:pPr>
-          </w:p>
-          <w:p>
-            <w:pPr>
-              <w:pStyle w:val="TableParagraph"/>
-              <w:rPr>
-                <w:sz w:val="20"/>
-              </w:rPr>
-            </w:pPr>
-          </w:p>
-          <w:p>
-            <w:pPr>
-              <w:pStyle w:val="TableParagraph"/>
-              <w:rPr>
-                <w:sz w:val="20"/>
-              </w:rPr>
-            </w:pPr>
-          </w:p>
-          <w:p>
-            <w:pPr>
-              <w:pStyle w:val="TableParagraph"/>
+              <w:keepNext/>
+              <w:keepLines/>
+              <w:rPr>
+                <w:sz w:val="20"/>
+              </w:rPr>
+            </w:pPr>
+          </w:p>
+          <w:p>
+            <w:pPr>
+              <w:pStyle w:val="TableParagraph"/>
+              <w:keepNext/>
+              <w:keepLines/>
+              <w:rPr>
+                <w:sz w:val="20"/>
+              </w:rPr>
+            </w:pPr>
+          </w:p>
+          <w:p>
+            <w:pPr>
+              <w:pStyle w:val="TableParagraph"/>
+              <w:keepNext/>
+              <w:keepLines/>
+              <w:rPr>
+                <w:sz w:val="20"/>
+              </w:rPr>
+            </w:pPr>
+          </w:p>
+          <w:p>
+            <w:pPr>
+              <w:pStyle w:val="TableParagraph"/>
+              <w:keepNext/>
+              <w:keepLines/>
+              <w:rPr>
+                <w:sz w:val="20"/>
+              </w:rPr>
+            </w:pPr>
+          </w:p>
+          <w:p>
+            <w:pPr>
+              <w:pStyle w:val="TableParagraph"/>
+              <w:keepNext/>
+              <w:keepLines/>
               <w:spacing w:before="171"/>
               <w:rPr>
                 <w:sz w:val="20"/>
@@ -2964,6 +3125,8 @@
           <w:p>
             <w:pPr>
               <w:pStyle w:val="TableParagraph"/>
+              <w:keepNext/>
+              <w:keepLines/>
               <w:tabs>
                 <w:tab w:val="left" w:pos="4341"/>
               </w:tabs>
@@ -3005,12 +3168,14 @@
         </w:tc>
         <w:tc>
           <w:tcPr>
-            <w:tcW w:w="5580" w:type="dxa"/>
-            <w:gridSpan w:val="2"/>
+            <w:tcW w:w="6205" w:type="dxa"/>
+            <w:gridSpan w:val="3"/>
           </w:tcPr>
           <w:p>
             <w:pPr>
               <w:pStyle w:val="TableParagraph"/>
+              <w:keepNext/>
+              <w:keepLines/>
               <w:tabs>
                 <w:tab w:val="left" w:pos="2264"/>
               </w:tabs>
@@ -3057,6 +3222,8 @@
           <w:p>
             <w:pPr>
               <w:pStyle w:val="TableParagraph"/>
+              <w:keepNext/>
+              <w:keepLines/>
               <w:tabs>
                 <w:tab w:val="left" w:pos="2264"/>
               </w:tabs>
@@ -3103,6 +3270,8 @@
           <w:p>
             <w:pPr>
               <w:pStyle w:val="TableParagraph"/>
+              <w:keepNext/>
+              <w:keepLines/>
               <w:tabs>
                 <w:tab w:val="left" w:pos="2264"/>
               </w:tabs>
@@ -3142,6 +3311,8 @@
           <w:p>
             <w:pPr>
               <w:pStyle w:val="TableParagraph"/>
+              <w:keepNext/>
+              <w:keepLines/>
               <w:tabs>
                 <w:tab w:val="left" w:pos="2264"/>
               </w:tabs>
@@ -3175,30 +3346,38 @@
           <w:p>
             <w:pPr>
               <w:pStyle w:val="TableParagraph"/>
-              <w:rPr>
-                <w:sz w:val="20"/>
-              </w:rPr>
-            </w:pPr>
-          </w:p>
-          <w:p>
-            <w:pPr>
-              <w:pStyle w:val="TableParagraph"/>
-              <w:rPr>
-                <w:sz w:val="20"/>
-              </w:rPr>
-            </w:pPr>
-          </w:p>
-          <w:p>
-            <w:pPr>
-              <w:pStyle w:val="TableParagraph"/>
-              <w:rPr>
-                <w:sz w:val="20"/>
-              </w:rPr>
-            </w:pPr>
-          </w:p>
-          <w:p>
-            <w:pPr>
-              <w:pStyle w:val="TableParagraph"/>
+              <w:keepNext/>
+              <w:keepLines/>
+              <w:rPr>
+                <w:sz w:val="20"/>
+              </w:rPr>
+            </w:pPr>
+          </w:p>
+          <w:p>
+            <w:pPr>
+              <w:pStyle w:val="TableParagraph"/>
+              <w:keepNext/>
+              <w:keepLines/>
+              <w:rPr>
+                <w:sz w:val="20"/>
+              </w:rPr>
+            </w:pPr>
+          </w:p>
+          <w:p>
+            <w:pPr>
+              <w:pStyle w:val="TableParagraph"/>
+              <w:keepNext/>
+              <w:keepLines/>
+              <w:rPr>
+                <w:sz w:val="20"/>
+              </w:rPr>
+            </w:pPr>
+          </w:p>
+          <w:p>
+            <w:pPr>
+              <w:pStyle w:val="TableParagraph"/>
+              <w:keepNext/>
+              <w:keepLines/>
               <w:spacing w:before="47"/>
               <w:rPr>
                 <w:sz w:val="20"/>
@@ -3208,6 +3387,8 @@
           <w:p>
             <w:pPr>
               <w:pStyle w:val="TableParagraph"/>
+              <w:keepNext/>
+              <w:keepLines/>
               <w:tabs>
                 <w:tab w:val="left" w:pos="4502"/>
               </w:tabs>
@@ -3255,16 +3436,34 @@
         </w:tc>
       </w:tr>
       <w:tr>
+        <w:tblPrEx>
+          <w:tblBorders>
+            <w:top w:val="single" w:sz="4" w:space="0" w:color="000000"/>
+            <w:left w:val="single" w:sz="4" w:space="0" w:color="000000"/>
+            <w:bottom w:val="single" w:sz="4" w:space="0" w:color="000000"/>
+            <w:right w:val="single" w:sz="4" w:space="0" w:color="000000"/>
+            <w:insideH w:val="single" w:sz="4" w:space="0" w:color="000000"/>
+            <w:insideV w:val="single" w:sz="4" w:space="0" w:color="000000"/>
+          </w:tblBorders>
+          <w:tblCellMar>
+            <w:left w:w="0" w:type="dxa"/>
+            <w:right w:w="0" w:type="dxa"/>
+          </w:tblCellMar>
+          <w:tblLook w:val="01E0" w:firstRow="1" w:lastRow="1" w:firstColumn="1" w:lastColumn="1" w:noHBand="0" w:noVBand="0"/>
+        </w:tblPrEx>
         <w:trPr>
+          <w:cantSplit/>
           <w:trHeight w:val="2574"/>
         </w:trPr>
         <w:tc>
           <w:tcPr>
-            <w:tcW w:w="5309" w:type="dxa"/>
+            <w:tcW w:w="4994" w:type="dxa"/>
           </w:tcPr>
           <w:p>
             <w:pPr>
               <w:pStyle w:val="TableParagraph"/>
+              <w:keepNext/>
+              <w:keepLines/>
               <w:tabs>
                 <w:tab w:val="left" w:pos="1980"/>
               </w:tabs>
@@ -3325,6 +3524,8 @@
           <w:p>
             <w:pPr>
               <w:pStyle w:val="TableParagraph"/>
+              <w:keepNext/>
+              <w:keepLines/>
               <w:tabs>
                 <w:tab w:val="left" w:pos="1620"/>
               </w:tabs>
@@ -3365,6 +3566,8 @@
           <w:p>
             <w:pPr>
               <w:pStyle w:val="TableParagraph"/>
+              <w:keepNext/>
+              <w:keepLines/>
               <w:tabs>
                 <w:tab w:val="left" w:pos="1620"/>
               </w:tabs>
@@ -3399,38 +3602,48 @@
           <w:p>
             <w:pPr>
               <w:pStyle w:val="TableParagraph"/>
-              <w:rPr>
-                <w:sz w:val="20"/>
-              </w:rPr>
-            </w:pPr>
-          </w:p>
-          <w:p>
-            <w:pPr>
-              <w:pStyle w:val="TableParagraph"/>
-              <w:rPr>
-                <w:sz w:val="20"/>
-              </w:rPr>
-            </w:pPr>
-          </w:p>
-          <w:p>
-            <w:pPr>
-              <w:pStyle w:val="TableParagraph"/>
-              <w:rPr>
-                <w:sz w:val="20"/>
-              </w:rPr>
-            </w:pPr>
-          </w:p>
-          <w:p>
-            <w:pPr>
-              <w:pStyle w:val="TableParagraph"/>
-              <w:rPr>
-                <w:sz w:val="20"/>
-              </w:rPr>
-            </w:pPr>
-          </w:p>
-          <w:p>
-            <w:pPr>
-              <w:pStyle w:val="TableParagraph"/>
+              <w:keepNext/>
+              <w:keepLines/>
+              <w:rPr>
+                <w:sz w:val="20"/>
+              </w:rPr>
+            </w:pPr>
+          </w:p>
+          <w:p>
+            <w:pPr>
+              <w:pStyle w:val="TableParagraph"/>
+              <w:keepNext/>
+              <w:keepLines/>
+              <w:rPr>
+                <w:sz w:val="20"/>
+              </w:rPr>
+            </w:pPr>
+          </w:p>
+          <w:p>
+            <w:pPr>
+              <w:pStyle w:val="TableParagraph"/>
+              <w:keepNext/>
+              <w:keepLines/>
+              <w:rPr>
+                <w:sz w:val="20"/>
+              </w:rPr>
+            </w:pPr>
+          </w:p>
+          <w:p>
+            <w:pPr>
+              <w:pStyle w:val="TableParagraph"/>
+              <w:keepNext/>
+              <w:keepLines/>
+              <w:rPr>
+                <w:sz w:val="20"/>
+              </w:rPr>
+            </w:pPr>
+          </w:p>
+          <w:p>
+            <w:pPr>
+              <w:pStyle w:val="TableParagraph"/>
+              <w:keepNext/>
+              <w:keepLines/>
               <w:spacing w:before="47"/>
               <w:rPr>
                 <w:sz w:val="20"/>
@@ -3440,6 +3653,8 @@
           <w:p>
             <w:pPr>
               <w:pStyle w:val="TableParagraph"/>
+              <w:keepNext/>
+              <w:keepLines/>
               <w:tabs>
                 <w:tab w:val="left" w:pos="4229"/>
               </w:tabs>
@@ -3481,12 +3696,14 @@
         </w:tc>
         <w:tc>
           <w:tcPr>
-            <w:tcW w:w="5580" w:type="dxa"/>
-            <w:gridSpan w:val="2"/>
+            <w:tcW w:w="6205" w:type="dxa"/>
+            <w:gridSpan w:val="3"/>
           </w:tcPr>
           <w:p>
             <w:pPr>
               <w:pStyle w:val="TableParagraph"/>
+              <w:keepNext/>
+              <w:keepLines/>
               <w:tabs>
                 <w:tab w:val="left" w:pos="2264"/>
               </w:tabs>
@@ -3533,6 +3750,8 @@
           <w:p>
             <w:pPr>
               <w:pStyle w:val="TableParagraph"/>
+              <w:keepNext/>
+              <w:keepLines/>
               <w:tabs>
                 <w:tab w:val="left" w:pos="2264"/>
               </w:tabs>
@@ -3579,6 +3798,8 @@
           <w:p>
             <w:pPr>
               <w:pStyle w:val="TableParagraph"/>
+              <w:keepNext/>
+              <w:keepLines/>
               <w:tabs>
                 <w:tab w:val="left" w:pos="2264"/>
               </w:tabs>
@@ -3618,6 +3839,8 @@
           <w:p>
             <w:pPr>
               <w:pStyle w:val="TableParagraph"/>
+              <w:keepNext/>
+              <w:keepLines/>
               <w:tabs>
                 <w:tab w:val="left" w:pos="2264"/>
               </w:tabs>
@@ -3651,30 +3874,38 @@
           <w:p>
             <w:pPr>
               <w:pStyle w:val="TableParagraph"/>
-              <w:rPr>
-                <w:sz w:val="20"/>
-              </w:rPr>
-            </w:pPr>
-          </w:p>
-          <w:p>
-            <w:pPr>
-              <w:pStyle w:val="TableParagraph"/>
-              <w:rPr>
-                <w:sz w:val="20"/>
-              </w:rPr>
-            </w:pPr>
-          </w:p>
-          <w:p>
-            <w:pPr>
-              <w:pStyle w:val="TableParagraph"/>
-              <w:rPr>
-                <w:sz w:val="20"/>
-              </w:rPr>
-            </w:pPr>
-          </w:p>
-          <w:p>
-            <w:pPr>
-              <w:pStyle w:val="TableParagraph"/>
+              <w:keepNext/>
+              <w:keepLines/>
+              <w:rPr>
+                <w:sz w:val="20"/>
+              </w:rPr>
+            </w:pPr>
+          </w:p>
+          <w:p>
+            <w:pPr>
+              <w:pStyle w:val="TableParagraph"/>
+              <w:keepNext/>
+              <w:keepLines/>
+              <w:rPr>
+                <w:sz w:val="20"/>
+              </w:rPr>
+            </w:pPr>
+          </w:p>
+          <w:p>
+            <w:pPr>
+              <w:pStyle w:val="TableParagraph"/>
+              <w:keepNext/>
+              <w:keepLines/>
+              <w:rPr>
+                <w:sz w:val="20"/>
+              </w:rPr>
+            </w:pPr>
+          </w:p>
+          <w:p>
+            <w:pPr>
+              <w:pStyle w:val="TableParagraph"/>
+              <w:keepNext/>
+              <w:keepLines/>
               <w:spacing w:before="28"/>
               <w:rPr>
                 <w:sz w:val="20"/>
@@ -3684,6 +3915,8 @@
           <w:p>
             <w:pPr>
               <w:pStyle w:val="TableParagraph"/>
+              <w:keepNext/>
+              <w:keepLines/>
               <w:tabs>
                 <w:tab w:val="left" w:pos="4502"/>
               </w:tabs>
@@ -3732,17 +3965,35 @@
         </w:tc>
       </w:tr>
       <w:tr>
+        <w:tblPrEx>
+          <w:tblBorders>
+            <w:top w:val="single" w:sz="4" w:space="0" w:color="000000"/>
+            <w:left w:val="single" w:sz="4" w:space="0" w:color="000000"/>
+            <w:bottom w:val="single" w:sz="4" w:space="0" w:color="000000"/>
+            <w:right w:val="single" w:sz="4" w:space="0" w:color="000000"/>
+            <w:insideH w:val="single" w:sz="4" w:space="0" w:color="000000"/>
+            <w:insideV w:val="single" w:sz="4" w:space="0" w:color="000000"/>
+          </w:tblBorders>
+          <w:tblCellMar>
+            <w:left w:w="0" w:type="dxa"/>
+            <w:right w:w="0" w:type="dxa"/>
+          </w:tblCellMar>
+          <w:tblLook w:val="01E0" w:firstRow="1" w:lastRow="1" w:firstColumn="1" w:lastColumn="1" w:noHBand="0" w:noVBand="0"/>
+        </w:tblPrEx>
         <w:trPr>
+          <w:cantSplit/>
           <w:trHeight w:val="3070"/>
         </w:trPr>
         <w:tc>
           <w:tcPr>
-            <w:tcW w:w="5309" w:type="dxa"/>
+            <w:tcW w:w="4994" w:type="dxa"/>
             <w:vMerge w:val="restart"/>
           </w:tcPr>
           <w:p>
             <w:pPr>
               <w:pStyle w:val="TableParagraph"/>
+              <w:keepNext/>
+              <w:keepLines/>
               <w:tabs>
                 <w:tab w:val="left" w:pos="2087"/>
               </w:tabs>
@@ -3756,6 +4007,7 @@
               <w:rPr>
                 <w:sz w:val="20"/>
               </w:rPr>
+              <w:lastRenderedPageBreak/>
               <w:t>V.</w:t>
             </w:r>
             <w:r>
@@ -3821,14 +4073,18 @@
           <w:p>
             <w:pPr>
               <w:pStyle w:val="TableParagraph"/>
-              <w:rPr>
-                <w:sz w:val="20"/>
-              </w:rPr>
-            </w:pPr>
-          </w:p>
-          <w:p>
-            <w:pPr>
-              <w:pStyle w:val="TableParagraph"/>
+              <w:keepNext/>
+              <w:keepLines/>
+              <w:rPr>
+                <w:sz w:val="20"/>
+              </w:rPr>
+            </w:pPr>
+          </w:p>
+          <w:p>
+            <w:pPr>
+              <w:pStyle w:val="TableParagraph"/>
+              <w:keepNext/>
+              <w:keepLines/>
               <w:spacing w:before="92"/>
               <w:rPr>
                 <w:sz w:val="20"/>
@@ -3838,6 +4094,8 @@
           <w:p>
             <w:pPr>
               <w:pStyle w:val="TableParagraph"/>
+              <w:keepNext/>
+              <w:keepLines/>
               <w:spacing w:before="1"/>
               <w:ind w:left="5" w:right="11"/>
               <w:jc w:val="center"/>
@@ -3882,38 +4140,48 @@
           <w:p>
             <w:pPr>
               <w:pStyle w:val="TableParagraph"/>
-              <w:rPr>
-                <w:sz w:val="20"/>
-              </w:rPr>
-            </w:pPr>
-          </w:p>
-          <w:p>
-            <w:pPr>
-              <w:pStyle w:val="TableParagraph"/>
-              <w:rPr>
-                <w:sz w:val="20"/>
-              </w:rPr>
-            </w:pPr>
-          </w:p>
-          <w:p>
-            <w:pPr>
-              <w:pStyle w:val="TableParagraph"/>
-              <w:rPr>
-                <w:sz w:val="20"/>
-              </w:rPr>
-            </w:pPr>
-          </w:p>
-          <w:p>
-            <w:pPr>
-              <w:pStyle w:val="TableParagraph"/>
-              <w:rPr>
-                <w:sz w:val="20"/>
-              </w:rPr>
-            </w:pPr>
-          </w:p>
-          <w:p>
-            <w:pPr>
-              <w:pStyle w:val="TableParagraph"/>
+              <w:keepNext/>
+              <w:keepLines/>
+              <w:rPr>
+                <w:sz w:val="20"/>
+              </w:rPr>
+            </w:pPr>
+          </w:p>
+          <w:p>
+            <w:pPr>
+              <w:pStyle w:val="TableParagraph"/>
+              <w:keepNext/>
+              <w:keepLines/>
+              <w:rPr>
+                <w:sz w:val="20"/>
+              </w:rPr>
+            </w:pPr>
+          </w:p>
+          <w:p>
+            <w:pPr>
+              <w:pStyle w:val="TableParagraph"/>
+              <w:keepNext/>
+              <w:keepLines/>
+              <w:rPr>
+                <w:sz w:val="20"/>
+              </w:rPr>
+            </w:pPr>
+          </w:p>
+          <w:p>
+            <w:pPr>
+              <w:pStyle w:val="TableParagraph"/>
+              <w:keepNext/>
+              <w:keepLines/>
+              <w:rPr>
+                <w:sz w:val="20"/>
+              </w:rPr>
+            </w:pPr>
+          </w:p>
+          <w:p>
+            <w:pPr>
+              <w:pStyle w:val="TableParagraph"/>
+              <w:keepNext/>
+              <w:keepLines/>
               <w:spacing w:before="228"/>
               <w:rPr>
                 <w:sz w:val="20"/>
@@ -3923,6 +4191,8 @@
           <w:p>
             <w:pPr>
               <w:pStyle w:val="TableParagraph"/>
+              <w:keepNext/>
+              <w:keepLines/>
               <w:ind w:left="11" w:right="6"/>
               <w:jc w:val="center"/>
               <w:rPr>
@@ -4048,6 +4318,8 @@
           <w:p>
             <w:pPr>
               <w:pStyle w:val="TableParagraph"/>
+              <w:keepNext/>
+              <w:keepLines/>
               <w:spacing w:before="2"/>
               <w:ind w:left="6" w:right="6"/>
               <w:jc w:val="center"/>
@@ -4079,8 +4351,8 @@
         </w:tc>
         <w:tc>
           <w:tcPr>
-            <w:tcW w:w="5580" w:type="dxa"/>
-            <w:gridSpan w:val="2"/>
+            <w:tcW w:w="6205" w:type="dxa"/>
+            <w:gridSpan w:val="3"/>
             <w:tcBorders>
               <w:bottom w:val="nil"/>
             </w:tcBorders>
@@ -4088,6 +4360,8 @@
           <w:p>
             <w:pPr>
               <w:pStyle w:val="TableParagraph"/>
+              <w:keepNext/>
+              <w:keepLines/>
               <w:spacing w:before="91"/>
               <w:ind w:left="103" w:right="103"/>
               <w:jc w:val="both"/>
@@ -4112,6 +4386,8 @@
           <w:p>
             <w:pPr>
               <w:pStyle w:val="TableParagraph"/>
+              <w:keepNext/>
+              <w:keepLines/>
               <w:spacing w:before="229"/>
               <w:ind w:left="114" w:right="117"/>
               <w:jc w:val="center"/>
@@ -4156,46 +4432,58 @@
           <w:p>
             <w:pPr>
               <w:pStyle w:val="TableParagraph"/>
-              <w:rPr>
-                <w:sz w:val="20"/>
-              </w:rPr>
-            </w:pPr>
-          </w:p>
-          <w:p>
-            <w:pPr>
-              <w:pStyle w:val="TableParagraph"/>
-              <w:rPr>
-                <w:sz w:val="20"/>
-              </w:rPr>
-            </w:pPr>
-          </w:p>
-          <w:p>
-            <w:pPr>
-              <w:pStyle w:val="TableParagraph"/>
-              <w:rPr>
-                <w:sz w:val="20"/>
-              </w:rPr>
-            </w:pPr>
-          </w:p>
-          <w:p>
-            <w:pPr>
-              <w:pStyle w:val="TableParagraph"/>
-              <w:rPr>
-                <w:sz w:val="20"/>
-              </w:rPr>
-            </w:pPr>
-          </w:p>
-          <w:p>
-            <w:pPr>
-              <w:pStyle w:val="TableParagraph"/>
-              <w:rPr>
-                <w:sz w:val="20"/>
-              </w:rPr>
-            </w:pPr>
-          </w:p>
-          <w:p>
-            <w:pPr>
-              <w:pStyle w:val="TableParagraph"/>
+              <w:keepNext/>
+              <w:keepLines/>
+              <w:rPr>
+                <w:sz w:val="20"/>
+              </w:rPr>
+            </w:pPr>
+          </w:p>
+          <w:p>
+            <w:pPr>
+              <w:pStyle w:val="TableParagraph"/>
+              <w:keepNext/>
+              <w:keepLines/>
+              <w:rPr>
+                <w:sz w:val="20"/>
+              </w:rPr>
+            </w:pPr>
+          </w:p>
+          <w:p>
+            <w:pPr>
+              <w:pStyle w:val="TableParagraph"/>
+              <w:keepNext/>
+              <w:keepLines/>
+              <w:rPr>
+                <w:sz w:val="20"/>
+              </w:rPr>
+            </w:pPr>
+          </w:p>
+          <w:p>
+            <w:pPr>
+              <w:pStyle w:val="TableParagraph"/>
+              <w:keepNext/>
+              <w:keepLines/>
+              <w:rPr>
+                <w:sz w:val="20"/>
+              </w:rPr>
+            </w:pPr>
+          </w:p>
+          <w:p>
+            <w:pPr>
+              <w:pStyle w:val="TableParagraph"/>
+              <w:keepNext/>
+              <w:keepLines/>
+              <w:rPr>
+                <w:sz w:val="20"/>
+              </w:rPr>
+            </w:pPr>
+          </w:p>
+          <w:p>
+            <w:pPr>
+              <w:pStyle w:val="TableParagraph"/>
+              <w:keepNext/>
+              <w:keepLines/>
               <w:spacing w:before="2"/>
               <w:rPr>
                 <w:sz w:val="20"/>
@@ -4205,6 +4493,8 @@
           <w:p>
             <w:pPr>
               <w:pStyle w:val="TableParagraph"/>
+              <w:keepNext/>
+              <w:keepLines/>
               <w:spacing w:line="199" w:lineRule="exact"/>
               <w:jc w:val="center"/>
               <w:rPr>
@@ -4230,12 +4520,28 @@
         </w:tc>
       </w:tr>
       <w:tr>
+        <w:tblPrEx>
+          <w:tblBorders>
+            <w:top w:val="single" w:sz="4" w:space="0" w:color="000000"/>
+            <w:left w:val="single" w:sz="4" w:space="0" w:color="000000"/>
+            <w:bottom w:val="single" w:sz="4" w:space="0" w:color="000000"/>
+            <w:right w:val="single" w:sz="4" w:space="0" w:color="000000"/>
+            <w:insideH w:val="single" w:sz="4" w:space="0" w:color="000000"/>
+            <w:insideV w:val="single" w:sz="4" w:space="0" w:color="000000"/>
+          </w:tblBorders>
+          <w:tblCellMar>
+            <w:left w:w="0" w:type="dxa"/>
+            <w:right w:w="0" w:type="dxa"/>
+          </w:tblCellMar>
+          <w:tblLook w:val="01E0" w:firstRow="1" w:lastRow="1" w:firstColumn="1" w:lastColumn="1" w:noHBand="0" w:noVBand="0"/>
+        </w:tblPrEx>
         <w:trPr>
+          <w:cantSplit/>
           <w:trHeight w:val="234"/>
         </w:trPr>
         <w:tc>
           <w:tcPr>
-            <w:tcW w:w="5309" w:type="dxa"/>
+            <w:tcW w:w="4994" w:type="dxa"/>
             <w:vMerge/>
             <w:tcBorders>
               <w:top w:val="nil"/>
@@ -4243,6 +4549,8 @@
           </w:tcPr>
           <w:p>
             <w:pPr>
+              <w:keepNext/>
+              <w:keepLines/>
               <w:rPr>
                 <w:sz w:val="2"/>
                 <w:szCs w:val="2"/>
@@ -4252,7 +4560,7 @@
         </w:tc>
         <w:tc>
           <w:tcPr>
-            <w:tcW w:w="2008" w:type="dxa"/>
+            <w:tcW w:w="1892" w:type="dxa"/>
             <w:tcBorders>
               <w:top w:val="nil"/>
               <w:right w:val="single" w:sz="36" w:space="0" w:color="F6F6F8"/>
@@ -4261,6 +4569,8 @@
           <w:p>
             <w:pPr>
               <w:pStyle w:val="TableParagraph"/>
+              <w:keepNext/>
+              <w:keepLines/>
               <w:spacing w:line="214" w:lineRule="exact"/>
               <w:ind w:right="36"/>
               <w:jc w:val="right"/>
@@ -4279,7 +4589,8 @@
         </w:tc>
         <w:tc>
           <w:tcPr>
-            <w:tcW w:w="3572" w:type="dxa"/>
+            <w:tcW w:w="4313" w:type="dxa"/>
+            <w:gridSpan w:val="2"/>
             <w:tcBorders>
               <w:top w:val="nil"/>
               <w:left w:val="single" w:sz="36" w:space="0" w:color="F6F6F8"/>
@@ -4288,6 +4599,8 @@
           <w:p>
             <w:pPr>
               <w:pStyle w:val="TableParagraph"/>
+              <w:keepNext/>
+              <w:keepLines/>
               <w:spacing w:line="214" w:lineRule="exact"/>
               <w:ind w:left="-8"/>
               <w:rPr>
@@ -4305,17 +4618,35 @@
         </w:tc>
       </w:tr>
       <w:tr>
+        <w:tblPrEx>
+          <w:tblBorders>
+            <w:top w:val="single" w:sz="4" w:space="0" w:color="000000"/>
+            <w:left w:val="single" w:sz="4" w:space="0" w:color="000000"/>
+            <w:bottom w:val="single" w:sz="4" w:space="0" w:color="000000"/>
+            <w:right w:val="single" w:sz="4" w:space="0" w:color="000000"/>
+            <w:insideH w:val="single" w:sz="4" w:space="0" w:color="000000"/>
+            <w:insideV w:val="single" w:sz="4" w:space="0" w:color="000000"/>
+          </w:tblBorders>
+          <w:tblCellMar>
+            <w:left w:w="0" w:type="dxa"/>
+            <w:right w:w="0" w:type="dxa"/>
+          </w:tblCellMar>
+          <w:tblLook w:val="01E0" w:firstRow="1" w:lastRow="1" w:firstColumn="1" w:lastColumn="1" w:noHBand="0" w:noVBand="0"/>
+        </w:tblPrEx>
         <w:trPr>
+          <w:cantSplit/>
           <w:trHeight w:val="686"/>
         </w:trPr>
         <w:tc>
           <w:tcPr>
-            <w:tcW w:w="10889" w:type="dxa"/>
-            <w:gridSpan w:val="3"/>
+            <w:tcW w:w="11199" w:type="dxa"/>
+            <w:gridSpan w:val="4"/>
           </w:tcPr>
           <w:p>
             <w:pPr>
               <w:pStyle w:val="TableParagraph"/>
+              <w:keepNext/>
+              <w:keepLines/>
               <w:spacing w:line="225" w:lineRule="exact"/>
               <w:ind w:left="107"/>
               <w:rPr>
@@ -4365,17 +4696,35 @@
         </w:tc>
       </w:tr>
       <w:tr>
+        <w:tblPrEx>
+          <w:tblBorders>
+            <w:top w:val="single" w:sz="4" w:space="0" w:color="000000"/>
+            <w:left w:val="single" w:sz="4" w:space="0" w:color="000000"/>
+            <w:bottom w:val="single" w:sz="4" w:space="0" w:color="000000"/>
+            <w:right w:val="single" w:sz="4" w:space="0" w:color="000000"/>
+            <w:insideH w:val="single" w:sz="4" w:space="0" w:color="000000"/>
+            <w:insideV w:val="single" w:sz="4" w:space="0" w:color="000000"/>
+          </w:tblBorders>
+          <w:tblCellMar>
+            <w:left w:w="0" w:type="dxa"/>
+            <w:right w:w="0" w:type="dxa"/>
+          </w:tblCellMar>
+          <w:tblLook w:val="01E0" w:firstRow="1" w:lastRow="1" w:firstColumn="1" w:lastColumn="1" w:noHBand="0" w:noVBand="0"/>
+        </w:tblPrEx>
         <w:trPr>
+          <w:cantSplit/>
           <w:trHeight w:val="921"/>
         </w:trPr>
         <w:tc>
           <w:tcPr>
-            <w:tcW w:w="10889" w:type="dxa"/>
-            <w:gridSpan w:val="3"/>
+            <w:tcW w:w="11199" w:type="dxa"/>
+            <w:gridSpan w:val="4"/>
           </w:tcPr>
           <w:p>
             <w:pPr>
               <w:pStyle w:val="TableParagraph"/>
+              <w:keepNext/>
+              <w:keepLines/>
               <w:spacing w:line="228" w:lineRule="exact"/>
               <w:ind w:left="107"/>
               <w:rPr>
@@ -4406,6 +4755,8 @@
           <w:p>
             <w:pPr>
               <w:pStyle w:val="TableParagraph"/>
+              <w:keepNext/>
+              <w:keepLines/>
               <w:spacing w:line="229" w:lineRule="exact"/>
               <w:ind w:left="107"/>
               <w:rPr>
@@ -4592,6 +4943,7 @@
           <w:p>
             <w:pPr>
               <w:pStyle w:val="TableParagraph"/>
+              <w:keepLines/>
               <w:spacing w:line="228" w:lineRule="exact"/>
               <w:ind w:left="107"/>
               <w:rPr>
@@ -4820,9 +5172,10 @@
       </w:r>
     </w:p>
     <w:sectPr>
-      <w:pgSz w:w="12240" w:h="18720"/>
+      <w:pgSz w:w="11906" w:h="16838" w:code="9"/>
       <w:pgMar w:top="600" w:right="360" w:bottom="820" w:left="360" w:header="0" w:footer="639" w:gutter="0"/>
       <w:cols w:space="720"/>
+      <w:docGrid w:linePitch="299"/>
     </w:sectPr>
   </w:body>
 </w:document>

</xml_diff>

<commit_message>
Meperbaiki alur cetak Surat dan hasil cetak surat
</commit_message>
<xml_diff>
--- a/resources/documents/Template_SPT_Perjadin_COLLECTIVE_V5.docx
+++ b/resources/documents/Template_SPT_Perjadin_COLLECTIVE_V5.docx
@@ -1718,6 +1718,7 @@
                     <w:tabs>
                       <w:tab w:val="left" w:pos="0"/>
                     </w:tabs>
+                    <w:spacing w:line="276" w:lineRule="auto"/>
                     <w:ind w:left="2160"/>
                     <w:jc w:val="center"/>
                   </w:pPr>
@@ -1738,7 +1739,7 @@
                       <w:tab w:val="left" w:pos="0"/>
                       <w:tab w:val="left" w:pos="273"/>
                     </w:tabs>
-                    <w:spacing w:before="240" w:after="240"/>
+                    <w:spacing w:before="360" w:after="360"/>
                     <w:ind w:left="2160"/>
                     <w:jc w:val="center"/>
                   </w:pPr>
@@ -1754,7 +1755,7 @@
                       <w:tab w:val="left" w:pos="0"/>
                       <w:tab w:val="left" w:pos="273"/>
                     </w:tabs>
-                    <w:spacing w:after="160"/>
+                    <w:spacing w:before="120" w:after="160"/>
                     <w:ind w:left="2160"/>
                     <w:jc w:val="center"/>
                   </w:pPr>
@@ -2072,7 +2073,16 @@
               <w:rPr>
                 <w:sz w:val="20"/>
               </w:rPr>
-            </w:pPr>
+              <w:jc w:val="center"/>
+            </w:pPr>
+            <w:r>
+              <w:rPr>
+                <w:rFonts w:ascii="Arial" w:hAnsi="Arial"/>
+                <w:sz w:val="20"/>
+                <w:szCs w:val="20"/>
+              </w:rPr>
+              <w:t>${ttd_pengirim}</w:t>
+            </w:r>
           </w:p>
           <w:p>
             <w:pPr>
@@ -4457,6 +4467,7 @@
               <w:rPr>
                 <w:sz w:val="20"/>
               </w:rPr>
+              <w:jc w:val="center"/>
             </w:pPr>
           </w:p>
           <w:p>
@@ -5064,113 +5075,6 @@
         </w:tc>
       </w:tr>
     </w:tbl>
-    <w:p>
-      <w:pPr>
-        <w:rPr>
-          <w:sz w:val="2"/>
-          <w:szCs w:val="2"/>
-        </w:rPr>
-      </w:pPr>
-      <w:r>
-        <w:rPr>
-          <w:noProof/>
-          <w:sz w:val="2"/>
-          <w:szCs w:val="2"/>
-        </w:rPr>
-        <mc:AlternateContent>
-          <mc:Choice Requires="wps">
-            <w:drawing>
-              <wp:anchor distT="0" distB="0" distL="0" distR="0" simplePos="0" relativeHeight="487472128" behindDoc="1" locked="0" layoutInCell="1" allowOverlap="1" wp14:anchorId="43C63355" wp14:editId="25AC19F9">
-                <wp:simplePos x="0" y="0"/>
-                <wp:positionH relativeFrom="page">
-                  <wp:posOffset>5254371</wp:posOffset>
-                </wp:positionH>
-                <wp:positionV relativeFrom="page">
-                  <wp:posOffset>1841211</wp:posOffset>
-                </wp:positionV>
-                <wp:extent cx="851535" cy="142240"/>
-                <wp:effectExtent l="0" t="0" r="0" b="0"/>
-                <wp:wrapNone/>
-                <wp:docPr id="22" name="Textbox 22"/>
-                <wp:cNvGraphicFramePr>
-                  <a:graphicFrameLocks xmlns:a="http://schemas.openxmlformats.org/drawingml/2006/main"/>
-                </wp:cNvGraphicFramePr>
-                <a:graphic xmlns:a="http://schemas.openxmlformats.org/drawingml/2006/main">
-                  <a:graphicData uri="http://schemas.microsoft.com/office/word/2010/wordprocessingShape">
-                    <wps:wsp>
-                      <wps:cNvSpPr txBox="1">
-                        <a:spLocks/>
-                      </wps:cNvSpPr>
-                      <wps:spPr>
-                        <a:xfrm>
-                          <a:off x="0" y="0"/>
-                          <a:ext cx="851535" cy="142240"/>
-                        </a:xfrm>
-                        <a:prstGeom prst="rect">
-                          <a:avLst/>
-                        </a:prstGeom>
-                      </wps:spPr>
-                      <wps:txbx>
-                        <w:txbxContent>
-                          <w:p>
-                            <w:pPr>
-                              <w:spacing w:line="223" w:lineRule="exact"/>
-                              <w:rPr>
-                                <w:sz w:val="20"/>
-                              </w:rPr>
-                            </w:pPr>
-                            <w:r>
-                              <w:rPr>
-                                <w:spacing w:val="-2"/>
-                                <w:sz w:val="20"/>
-                              </w:rPr>
-                              <w:t>${ttd_pengirim}</w:t>
-                            </w:r>
-                          </w:p>
-                        </w:txbxContent>
-                      </wps:txbx>
-                      <wps:bodyPr wrap="square" lIns="0" tIns="0" rIns="0" bIns="0" rtlCol="0">
-                        <a:noAutofit/>
-                      </wps:bodyPr>
-                    </wps:wsp>
-                  </a:graphicData>
-                </a:graphic>
-              </wp:anchor>
-            </w:drawing>
-          </mc:Choice>
-          <mc:Fallback>
-            <w:pict>
-              <v:shapetype w14:anchorId="43C63355" id="_x0000_t202" coordsize="21600,21600" o:spt="202" path="m,l,21600r21600,l21600,xe">
-                <v:stroke joinstyle="miter"/>
-                <v:path gradientshapeok="t" o:connecttype="rect"/>
-              </v:shapetype>
-              <v:shape id="Textbox 22" o:spid="_x0000_s1026" type="#_x0000_t202" style="position:absolute;margin-left:413.75pt;margin-top:145pt;width:67.05pt;height:11.2pt;z-index:-15844352;visibility:visible;mso-wrap-style:square;mso-wrap-distance-left:0;mso-wrap-distance-top:0;mso-wrap-distance-right:0;mso-wrap-distance-bottom:0;mso-position-horizontal:absolute;mso-position-horizontal-relative:page;mso-position-vertical:absolute;mso-position-vertical-relative:page;v-text-anchor:top" o:gfxdata="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" filled="f" stroked="f">
-                <v:textbox inset="0,0,0,0">
-                  <w:txbxContent>
-                    <w:p>
-                      <w:pPr>
-                        <w:spacing w:line="223" w:lineRule="exact"/>
-                        <w:rPr>
-                          <w:sz w:val="20"/>
-                        </w:rPr>
-                      </w:pPr>
-                      <w:r>
-                        <w:rPr>
-                          <w:spacing w:val="-2"/>
-                          <w:sz w:val="20"/>
-                        </w:rPr>
-                        <w:t>${ttd_pengirim}</w:t>
-                      </w:r>
-                    </w:p>
-                  </w:txbxContent>
-                </v:textbox>
-                <w10:wrap anchorx="page" anchory="page"/>
-              </v:shape>
-            </w:pict>
-          </mc:Fallback>
-        </mc:AlternateContent>
-      </w:r>
-    </w:p>
     <w:sectPr>
       <w:pgSz w:w="11906" w:h="16838" w:code="9"/>
       <w:pgMar w:top="600" w:right="360" w:bottom="820" w:left="360" w:header="0" w:footer="639" w:gutter="0"/>

</xml_diff>